<commit_message>
AF_V1- Activation Function is Changed
</commit_message>
<xml_diff>
--- a/Research_Results.docx
+++ b/Research_Results.docx
@@ -109,26 +109,16 @@
             <w:pPr>
               <w:cnfStyle w:val="000000100000" w:firstRow="0" w:lastRow="0" w:firstColumn="0" w:lastColumn="0" w:oddVBand="0" w:evenVBand="0" w:oddHBand="1" w:evenHBand="0" w:firstRowFirstColumn="0" w:firstRowLastColumn="0" w:lastRowFirstColumn="0" w:lastRowLastColumn="0"/>
             </w:pPr>
-            <w:proofErr w:type="spellStart"/>
-            <w:r>
-              <w:t>val_accuracy</w:t>
-            </w:r>
-            <w:proofErr w:type="spellEnd"/>
-            <w:r>
-              <w:t>: 0.5000</w:t>
+            <w:r>
+              <w:t>val_accuracy: 0.5000</w:t>
             </w:r>
           </w:p>
           <w:p>
             <w:pPr>
               <w:cnfStyle w:val="000000100000" w:firstRow="0" w:lastRow="0" w:firstColumn="0" w:lastColumn="0" w:oddVBand="0" w:evenVBand="0" w:oddHBand="1" w:evenHBand="0" w:firstRowFirstColumn="0" w:firstRowLastColumn="0" w:lastRowFirstColumn="0" w:lastRowLastColumn="0"/>
             </w:pPr>
-            <w:proofErr w:type="spellStart"/>
-            <w:r>
-              <w:t>val_loss</w:t>
-            </w:r>
-            <w:proofErr w:type="spellEnd"/>
-            <w:r>
-              <w:t>: 2.9069</w:t>
+            <w:r>
+              <w:t>val_loss: 2.9069</w:t>
             </w:r>
           </w:p>
         </w:tc>
@@ -139,93 +129,41 @@
           <w:p>
             <w:pPr>
               <w:cnfStyle w:val="000000100000" w:firstRow="0" w:lastRow="0" w:firstColumn="0" w:lastColumn="0" w:oddVBand="0" w:evenVBand="0" w:oddHBand="1" w:evenHBand="0" w:firstRowFirstColumn="0" w:firstRowLastColumn="0" w:lastRowFirstColumn="0" w:lastRowLastColumn="0"/>
-              <w:rPr>
-                <w:lang w:val="en-PK"/>
-              </w:rPr>
-            </w:pPr>
-            <w:r>
-              <w:rPr>
-                <w:lang w:val="en-PK"/>
-              </w:rPr>
+            </w:pPr>
+            <w:r>
               <w:t>accuracy: 0.9568</w:t>
             </w:r>
           </w:p>
           <w:p>
             <w:pPr>
               <w:cnfStyle w:val="000000100000" w:firstRow="0" w:lastRow="0" w:firstColumn="0" w:lastColumn="0" w:oddVBand="0" w:evenVBand="0" w:oddHBand="1" w:evenHBand="0" w:firstRowFirstColumn="0" w:firstRowLastColumn="0" w:lastRowFirstColumn="0" w:lastRowLastColumn="0"/>
-              <w:rPr>
-                <w:lang w:val="en-PK"/>
-              </w:rPr>
-            </w:pPr>
-            <w:r>
-              <w:rPr>
-                <w:lang w:val="en-PK"/>
-              </w:rPr>
-              <w:t xml:space="preserve">loss: 0.1201 </w:t>
-            </w:r>
-            <w:proofErr w:type="spellStart"/>
-            <w:r>
-              <w:rPr>
-                <w:lang w:val="en-PK"/>
-              </w:rPr>
-              <w:t>val_accuracy</w:t>
-            </w:r>
-            <w:proofErr w:type="spellEnd"/>
-            <w:r>
-              <w:rPr>
-                <w:lang w:val="en-PK"/>
-              </w:rPr>
-              <w:t>: 0.8934</w:t>
+            </w:pPr>
+            <w:r>
+              <w:t>loss: 0.1201 val_accuracy: 0.8934</w:t>
             </w:r>
           </w:p>
           <w:p>
             <w:pPr>
               <w:cnfStyle w:val="000000100000" w:firstRow="0" w:lastRow="0" w:firstColumn="0" w:lastColumn="0" w:oddVBand="0" w:evenVBand="0" w:oddHBand="1" w:evenHBand="0" w:firstRowFirstColumn="0" w:firstRowLastColumn="0" w:lastRowFirstColumn="0" w:lastRowLastColumn="0"/>
-              <w:rPr>
-                <w:lang w:val="en-PK"/>
-              </w:rPr>
-            </w:pPr>
-            <w:proofErr w:type="spellStart"/>
-            <w:r>
-              <w:rPr>
-                <w:lang w:val="en-PK"/>
-              </w:rPr>
-              <w:t>val_loss</w:t>
-            </w:r>
-            <w:proofErr w:type="spellEnd"/>
-            <w:r>
-              <w:rPr>
-                <w:lang w:val="en-PK"/>
-              </w:rPr>
-              <w:t>: 1.7475</w:t>
+            </w:pPr>
+            <w:r>
+              <w:t>val_loss: 1.7475</w:t>
             </w:r>
           </w:p>
           <w:p>
             <w:pPr>
               <w:cnfStyle w:val="000000100000" w:firstRow="0" w:lastRow="0" w:firstColumn="0" w:lastColumn="0" w:oddVBand="0" w:evenVBand="0" w:oddHBand="1" w:evenHBand="0" w:firstRowFirstColumn="0" w:firstRowLastColumn="0" w:lastRowFirstColumn="0" w:lastRowLastColumn="0"/>
-              <w:rPr>
-                <w:lang w:val="en-PK"/>
-              </w:rPr>
-            </w:pPr>
-            <w:r>
-              <w:rPr>
-                <w:lang w:val="en-PK"/>
-              </w:rPr>
+            </w:pPr>
+            <w:r>
               <w:br/>
             </w:r>
             <w:r>
-              <w:rPr>
-                <w:lang w:val="en-PK"/>
-              </w:rPr>
               <w:t>Test metrics: {'accuracy': 0.9759199023246765, 'loss': 0.17341348528862}</w:t>
             </w:r>
           </w:p>
           <w:p>
             <w:pPr>
               <w:cnfStyle w:val="000000100000" w:firstRow="0" w:lastRow="0" w:firstColumn="0" w:lastColumn="0" w:oddVBand="0" w:evenVBand="0" w:oddHBand="1" w:evenHBand="0" w:firstRowFirstColumn="0" w:firstRowLastColumn="0" w:lastRowFirstColumn="0" w:lastRowLastColumn="0"/>
-              <w:rPr>
-                <w:lang w:val="en-PK"/>
-              </w:rPr>
             </w:pPr>
           </w:p>
         </w:tc>
@@ -249,13 +187,8 @@
               <w:cnfStyle w:val="000000100000" w:firstRow="0" w:lastRow="0" w:firstColumn="0" w:lastColumn="0" w:oddVBand="0" w:evenVBand="0" w:oddHBand="1" w:evenHBand="0" w:firstRowFirstColumn="0" w:firstRowLastColumn="0" w:lastRowFirstColumn="0" w:lastRowLastColumn="0"/>
             </w:pPr>
             <w:r>
-              <w:t xml:space="preserve">Attention - </w:t>
-            </w:r>
-            <w:proofErr w:type="spellStart"/>
-            <w:r>
-              <w:t>softmax</w:t>
-            </w:r>
-            <w:proofErr w:type="spellEnd"/>
+              <w:t>Attention - softmax</w:t>
+            </w:r>
           </w:p>
           <w:p>
             <w:pPr>
@@ -265,13 +198,8 @@
               <w:t>O</w:t>
             </w:r>
             <w:r>
-              <w:t xml:space="preserve">utput – </w:t>
-            </w:r>
-            <w:proofErr w:type="spellStart"/>
-            <w:r>
-              <w:t>softmax</w:t>
-            </w:r>
-            <w:proofErr w:type="spellEnd"/>
+              <w:t>utput – softmax</w:t>
+            </w:r>
           </w:p>
           <w:p>
             <w:pPr>
@@ -286,7 +214,11 @@
             <w:cnfStyle w:val="001000000000" w:firstRow="0" w:lastRow="0" w:firstColumn="1" w:lastColumn="0" w:oddVBand="0" w:evenVBand="0" w:oddHBand="0" w:evenHBand="0" w:firstRowFirstColumn="0" w:firstRowLastColumn="0" w:lastRowFirstColumn="0" w:lastRowLastColumn="0"/>
             <w:tcW w:w="2134" w:type="dxa"/>
           </w:tcPr>
-          <w:p/>
+          <w:p>
+            <w:r>
+              <w:t>AF_V1</w:t>
+            </w:r>
+          </w:p>
         </w:tc>
         <w:tc>
           <w:tcPr>
@@ -305,9 +237,6 @@
           <w:p>
             <w:pPr>
               <w:cnfStyle w:val="000000000000" w:firstRow="0" w:lastRow="0" w:firstColumn="0" w:lastColumn="0" w:oddVBand="0" w:evenVBand="0" w:oddHBand="0" w:evenHBand="0" w:firstRowFirstColumn="0" w:firstRowLastColumn="0" w:lastRowFirstColumn="0" w:lastRowLastColumn="0"/>
-              <w:rPr>
-                <w:lang w:val="en-PK"/>
-              </w:rPr>
             </w:pPr>
           </w:p>
         </w:tc>
@@ -324,13 +253,8 @@
             </w:r>
             <w:r>
               <w:br/>
-              <w:t xml:space="preserve">Attention → </w:t>
-            </w:r>
-            <w:proofErr w:type="spellStart"/>
-            <w:r>
-              <w:t>Softmax</w:t>
-            </w:r>
-            <w:proofErr w:type="spellEnd"/>
+              <w:t>Attention → Softmax</w:t>
+            </w:r>
             <w:r>
               <w:br/>
               <w:t>Output → Sigmoid</w:t>
@@ -366,9 +290,6 @@
           <w:p>
             <w:pPr>
               <w:cnfStyle w:val="000000100000" w:firstRow="0" w:lastRow="0" w:firstColumn="0" w:lastColumn="0" w:oddVBand="0" w:evenVBand="0" w:oddHBand="1" w:evenHBand="0" w:firstRowFirstColumn="0" w:firstRowLastColumn="0" w:lastRowFirstColumn="0" w:lastRowLastColumn="0"/>
-              <w:rPr>
-                <w:lang w:val="en-PK"/>
-              </w:rPr>
             </w:pPr>
           </w:p>
         </w:tc>
@@ -385,13 +306,8 @@
             </w:r>
             <w:r>
               <w:br/>
-              <w:t xml:space="preserve">Attention → </w:t>
-            </w:r>
-            <w:proofErr w:type="spellStart"/>
-            <w:r>
-              <w:t>Softmax</w:t>
-            </w:r>
-            <w:proofErr w:type="spellEnd"/>
+              <w:t>Attention → Softmax</w:t>
+            </w:r>
             <w:r>
               <w:br/>
               <w:t>Output → Sigmoid</w:t>
@@ -424,9 +340,6 @@
           <w:p>
             <w:pPr>
               <w:cnfStyle w:val="000000000000" w:firstRow="0" w:lastRow="0" w:firstColumn="0" w:lastColumn="0" w:oddVBand="0" w:evenVBand="0" w:oddHBand="0" w:evenHBand="0" w:firstRowFirstColumn="0" w:firstRowLastColumn="0" w:lastRowFirstColumn="0" w:lastRowLastColumn="0"/>
-              <w:rPr>
-                <w:lang w:val="en-PK"/>
-              </w:rPr>
             </w:pPr>
           </w:p>
         </w:tc>
@@ -443,13 +356,8 @@
             </w:r>
             <w:r>
               <w:br/>
-              <w:t xml:space="preserve">Attention → </w:t>
-            </w:r>
-            <w:proofErr w:type="spellStart"/>
-            <w:r>
-              <w:t>Softmax</w:t>
-            </w:r>
-            <w:proofErr w:type="spellEnd"/>
+              <w:t>Attention → Softmax</w:t>
+            </w:r>
             <w:r>
               <w:br/>
               <w:t>Output → Sigmoid</w:t>
@@ -485,9 +393,6 @@
           <w:p>
             <w:pPr>
               <w:cnfStyle w:val="000000100000" w:firstRow="0" w:lastRow="0" w:firstColumn="0" w:lastColumn="0" w:oddVBand="0" w:evenVBand="0" w:oddHBand="1" w:evenHBand="0" w:firstRowFirstColumn="0" w:firstRowLastColumn="0" w:lastRowFirstColumn="0" w:lastRowLastColumn="0"/>
-              <w:rPr>
-                <w:lang w:val="en-PK"/>
-              </w:rPr>
             </w:pPr>
           </w:p>
         </w:tc>
@@ -504,13 +409,8 @@
             </w:r>
             <w:r>
               <w:br/>
-              <w:t xml:space="preserve">Attention → </w:t>
-            </w:r>
-            <w:proofErr w:type="spellStart"/>
-            <w:r>
-              <w:t>Softmax</w:t>
-            </w:r>
-            <w:proofErr w:type="spellEnd"/>
+              <w:t>Attention → Softmax</w:t>
+            </w:r>
             <w:r>
               <w:br/>
               <w:t>Output → Sigmoid</w:t>
@@ -1210,6 +1110,7 @@
   <w:style w:type="character" w:default="1" w:styleId="DefaultParagraphFont">
     <w:name w:val="Default Paragraph Font"/>
     <w:uiPriority w:val="1"/>
+    <w:semiHidden/>
     <w:unhideWhenUsed/>
   </w:style>
   <w:style w:type="table" w:default="1" w:styleId="TableNormal">

</xml_diff>

<commit_message>
AF_V3: add audio experiment results (Swish activation)
</commit_message>
<xml_diff>
--- a/Research_Results.docx
+++ b/Research_Results.docx
@@ -109,26 +109,16 @@
             <w:pPr>
               <w:cnfStyle w:val="000000100000" w:firstRow="0" w:lastRow="0" w:firstColumn="0" w:lastColumn="0" w:oddVBand="0" w:evenVBand="0" w:oddHBand="1" w:evenHBand="0" w:firstRowFirstColumn="0" w:firstRowLastColumn="0" w:lastRowFirstColumn="0" w:lastRowLastColumn="0"/>
             </w:pPr>
-            <w:proofErr w:type="spellStart"/>
-            <w:r>
-              <w:t>val_accuracy</w:t>
-            </w:r>
-            <w:proofErr w:type="spellEnd"/>
-            <w:r>
-              <w:t>: 0.5000</w:t>
+            <w:r>
+              <w:t>val_accuracy: 0.5000</w:t>
             </w:r>
           </w:p>
           <w:p>
             <w:pPr>
               <w:cnfStyle w:val="000000100000" w:firstRow="0" w:lastRow="0" w:firstColumn="0" w:lastColumn="0" w:oddVBand="0" w:evenVBand="0" w:oddHBand="1" w:evenHBand="0" w:firstRowFirstColumn="0" w:firstRowLastColumn="0" w:lastRowFirstColumn="0" w:lastRowLastColumn="0"/>
             </w:pPr>
-            <w:proofErr w:type="spellStart"/>
-            <w:r>
-              <w:t>val_loss</w:t>
-            </w:r>
-            <w:proofErr w:type="spellEnd"/>
-            <w:r>
-              <w:t>: 2.9069</w:t>
+            <w:r>
+              <w:t>val_loss: 2.9069</w:t>
             </w:r>
           </w:p>
         </w:tc>
@@ -149,28 +139,15 @@
               <w:cnfStyle w:val="000000100000" w:firstRow="0" w:lastRow="0" w:firstColumn="0" w:lastColumn="0" w:oddVBand="0" w:evenVBand="0" w:oddHBand="1" w:evenHBand="0" w:firstRowFirstColumn="0" w:firstRowLastColumn="0" w:lastRowFirstColumn="0" w:lastRowLastColumn="0"/>
             </w:pPr>
             <w:r>
-              <w:t xml:space="preserve">loss: 0.1201 </w:t>
-            </w:r>
-            <w:proofErr w:type="spellStart"/>
-            <w:r>
-              <w:t>val_accuracy</w:t>
-            </w:r>
-            <w:proofErr w:type="spellEnd"/>
-            <w:r>
-              <w:t>: 0.8934</w:t>
+              <w:t>loss: 0.1201 val_accuracy: 0.8934</w:t>
             </w:r>
           </w:p>
           <w:p>
             <w:pPr>
               <w:cnfStyle w:val="000000100000" w:firstRow="0" w:lastRow="0" w:firstColumn="0" w:lastColumn="0" w:oddVBand="0" w:evenVBand="0" w:oddHBand="1" w:evenHBand="0" w:firstRowFirstColumn="0" w:firstRowLastColumn="0" w:lastRowFirstColumn="0" w:lastRowLastColumn="0"/>
             </w:pPr>
-            <w:proofErr w:type="spellStart"/>
-            <w:r>
-              <w:t>val_loss</w:t>
-            </w:r>
-            <w:proofErr w:type="spellEnd"/>
-            <w:r>
-              <w:t>: 1.7475</w:t>
+            <w:r>
+              <w:t>val_loss: 1.7475</w:t>
             </w:r>
           </w:p>
           <w:p>
@@ -210,13 +187,8 @@
               <w:cnfStyle w:val="000000100000" w:firstRow="0" w:lastRow="0" w:firstColumn="0" w:lastColumn="0" w:oddVBand="0" w:evenVBand="0" w:oddHBand="1" w:evenHBand="0" w:firstRowFirstColumn="0" w:firstRowLastColumn="0" w:lastRowFirstColumn="0" w:lastRowLastColumn="0"/>
             </w:pPr>
             <w:r>
-              <w:t xml:space="preserve">Attention - </w:t>
-            </w:r>
-            <w:proofErr w:type="spellStart"/>
-            <w:r>
-              <w:t>softmax</w:t>
-            </w:r>
-            <w:proofErr w:type="spellEnd"/>
+              <w:t>Attention - softmax</w:t>
+            </w:r>
           </w:p>
           <w:p>
             <w:pPr>
@@ -226,13 +198,8 @@
               <w:t>O</w:t>
             </w:r>
             <w:r>
-              <w:t xml:space="preserve">utput – </w:t>
-            </w:r>
-            <w:proofErr w:type="spellStart"/>
-            <w:r>
-              <w:t>softmax</w:t>
-            </w:r>
-            <w:proofErr w:type="spellEnd"/>
+              <w:t>utput – softmax</w:t>
+            </w:r>
           </w:p>
           <w:p>
             <w:pPr>
@@ -269,13 +236,8 @@
             <w:pPr>
               <w:cnfStyle w:val="000000000000" w:firstRow="0" w:lastRow="0" w:firstColumn="0" w:lastColumn="0" w:oddVBand="0" w:evenVBand="0" w:oddHBand="0" w:evenHBand="0" w:firstRowFirstColumn="0" w:firstRowLastColumn="0" w:lastRowFirstColumn="0" w:lastRowLastColumn="0"/>
             </w:pPr>
-            <w:proofErr w:type="spellStart"/>
-            <w:r>
-              <w:t>val_accuracy</w:t>
-            </w:r>
-            <w:proofErr w:type="spellEnd"/>
-            <w:r>
-              <w:t>: 0.5000</w:t>
+            <w:r>
+              <w:t>val_accuracy: 0.5000</w:t>
             </w:r>
           </w:p>
           <w:p>
@@ -357,13 +319,8 @@
             <w:r>
               <w:br/>
             </w:r>
-            <w:proofErr w:type="spellStart"/>
-            <w:r>
-              <w:t>val_accuracy</w:t>
-            </w:r>
-            <w:proofErr w:type="spellEnd"/>
-            <w:r>
-              <w:t>: 0.8934</w:t>
+            <w:r>
+              <w:t>val_accuracy: 0.8934</w:t>
             </w:r>
           </w:p>
           <w:p>
@@ -382,234 +339,83 @@
           <w:p>
             <w:pPr>
               <w:cnfStyle w:val="000000000000" w:firstRow="0" w:lastRow="0" w:firstColumn="0" w:lastColumn="0" w:oddVBand="0" w:evenVBand="0" w:oddHBand="0" w:evenHBand="0" w:firstRowFirstColumn="0" w:firstRowLastColumn="0" w:lastRowFirstColumn="0" w:lastRowLastColumn="0"/>
-              <w:rPr>
-                <w:lang w:val="en-PK"/>
-              </w:rPr>
             </w:pPr>
             <w:r>
               <w:rPr>
                 <w:rFonts w:ascii="Segoe UI Emoji" w:hAnsi="Segoe UI Emoji" w:cs="Segoe UI Emoji"/>
-                <w:lang w:val="en-PK"/>
               </w:rPr>
               <w:t>📌</w:t>
             </w:r>
             <w:r>
-              <w:rPr>
-                <w:lang w:val="en-PK"/>
-              </w:rPr>
               <w:t xml:space="preserve"> Threshold metrics @ 0.50</w:t>
             </w:r>
           </w:p>
           <w:p>
             <w:pPr>
               <w:cnfStyle w:val="000000000000" w:firstRow="0" w:lastRow="0" w:firstColumn="0" w:lastColumn="0" w:oddVBand="0" w:evenVBand="0" w:oddHBand="0" w:evenHBand="0" w:firstRowFirstColumn="0" w:firstRowLastColumn="0" w:lastRowFirstColumn="0" w:lastRowLastColumn="0"/>
-              <w:rPr>
-                <w:lang w:val="en-PK"/>
-              </w:rPr>
-            </w:pPr>
-            <w:r>
-              <w:rPr>
-                <w:lang w:val="en-PK"/>
-              </w:rPr>
+            </w:pPr>
+            <w:r>
               <w:t>Confusion Matrix [[TN, FP], [FN, TP]]:</w:t>
             </w:r>
           </w:p>
           <w:p>
             <w:pPr>
               <w:cnfStyle w:val="000000000000" w:firstRow="0" w:lastRow="0" w:firstColumn="0" w:lastColumn="0" w:oddVBand="0" w:evenVBand="0" w:oddHBand="0" w:evenHBand="0" w:firstRowFirstColumn="0" w:firstRowLastColumn="0" w:lastRowFirstColumn="0" w:lastRowLastColumn="0"/>
-              <w:rPr>
-                <w:lang w:val="en-PK"/>
-              </w:rPr>
-            </w:pPr>
-            <w:r>
-              <w:rPr>
-                <w:lang w:val="en-PK"/>
-              </w:rPr>
-              <w:t>[</w:t>
-            </w:r>
-            <w:proofErr w:type="gramStart"/>
-            <w:r>
-              <w:rPr>
-                <w:lang w:val="en-PK"/>
-              </w:rPr>
-              <w:t>[  2655</w:t>
-            </w:r>
-            <w:proofErr w:type="gramEnd"/>
-            <w:r>
-              <w:rPr>
-                <w:lang w:val="en-PK"/>
-              </w:rPr>
-              <w:t xml:space="preserve">  12214]</w:t>
-            </w:r>
-          </w:p>
-          <w:p>
-            <w:pPr>
-              <w:cnfStyle w:val="000000000000" w:firstRow="0" w:lastRow="0" w:firstColumn="0" w:lastColumn="0" w:oddVBand="0" w:evenVBand="0" w:oddHBand="0" w:evenHBand="0" w:firstRowFirstColumn="0" w:firstRowLastColumn="0" w:lastRowFirstColumn="0" w:lastRowLastColumn="0"/>
-              <w:rPr>
-                <w:lang w:val="en-PK"/>
-              </w:rPr>
-            </w:pPr>
-            <w:r>
-              <w:rPr>
-                <w:lang w:val="en-PK"/>
-              </w:rPr>
+            </w:pPr>
+            <w:r>
+              <w:t>[[  2655  12214]</w:t>
+            </w:r>
+          </w:p>
+          <w:p>
+            <w:pPr>
+              <w:cnfStyle w:val="000000000000" w:firstRow="0" w:lastRow="0" w:firstColumn="0" w:lastColumn="0" w:oddVBand="0" w:evenVBand="0" w:oddHBand="0" w:evenHBand="0" w:firstRowFirstColumn="0" w:firstRowLastColumn="0" w:lastRowFirstColumn="0" w:lastRowLastColumn="0"/>
+            </w:pPr>
+            <w:r>
               <w:t xml:space="preserve"> [   414 518644]]</w:t>
             </w:r>
           </w:p>
           <w:p>
             <w:pPr>
               <w:cnfStyle w:val="000000000000" w:firstRow="0" w:lastRow="0" w:firstColumn="0" w:lastColumn="0" w:oddVBand="0" w:evenVBand="0" w:oddHBand="0" w:evenHBand="0" w:firstRowFirstColumn="0" w:firstRowLastColumn="0" w:lastRowFirstColumn="0" w:lastRowLastColumn="0"/>
-              <w:rPr>
-                <w:lang w:val="en-PK"/>
-              </w:rPr>
-            </w:pPr>
-            <w:r>
-              <w:rPr>
-                <w:lang w:val="en-PK"/>
-              </w:rPr>
+            </w:pPr>
+            <w:r>
               <w:t>Precision: 0.9770 | Recall: 0.9992 | F1: 0.9880 | Accuracy: 0.9763</w:t>
             </w:r>
           </w:p>
           <w:p>
             <w:pPr>
               <w:cnfStyle w:val="000000000000" w:firstRow="0" w:lastRow="0" w:firstColumn="0" w:lastColumn="0" w:oddVBand="0" w:evenVBand="0" w:oddHBand="0" w:evenHBand="0" w:firstRowFirstColumn="0" w:firstRowLastColumn="0" w:lastRowFirstColumn="0" w:lastRowLastColumn="0"/>
-              <w:rPr>
-                <w:lang w:val="en-PK"/>
-              </w:rPr>
-            </w:pPr>
-          </w:p>
-          <w:p>
-            <w:pPr>
-              <w:cnfStyle w:val="000000000000" w:firstRow="0" w:lastRow="0" w:firstColumn="0" w:lastColumn="0" w:oddVBand="0" w:evenVBand="0" w:oddHBand="0" w:evenHBand="0" w:firstRowFirstColumn="0" w:firstRowLastColumn="0" w:lastRowFirstColumn="0" w:lastRowLastColumn="0"/>
-              <w:rPr>
-                <w:lang w:val="en-PK"/>
-              </w:rPr>
+            </w:pPr>
+          </w:p>
+          <w:p>
+            <w:pPr>
+              <w:cnfStyle w:val="000000000000" w:firstRow="0" w:lastRow="0" w:firstColumn="0" w:lastColumn="0" w:oddVBand="0" w:evenVBand="0" w:oddHBand="0" w:evenHBand="0" w:firstRowFirstColumn="0" w:firstRowLastColumn="0" w:lastRowFirstColumn="0" w:lastRowLastColumn="0"/>
             </w:pPr>
             <w:r>
               <w:rPr>
                 <w:rFonts w:ascii="Segoe UI Emoji" w:hAnsi="Segoe UI Emoji" w:cs="Segoe UI Emoji"/>
-                <w:lang w:val="en-PK"/>
               </w:rPr>
               <w:t>✅</w:t>
             </w:r>
             <w:r>
-              <w:rPr>
-                <w:lang w:val="en-PK"/>
-              </w:rPr>
               <w:t xml:space="preserve"> Audio training session completed with the latest repository code.</w:t>
             </w:r>
           </w:p>
           <w:p>
             <w:pPr>
               <w:cnfStyle w:val="000000000000" w:firstRow="0" w:lastRow="0" w:firstColumn="0" w:lastColumn="0" w:oddVBand="0" w:evenVBand="0" w:oddHBand="0" w:evenHBand="0" w:firstRowFirstColumn="0" w:firstRowLastColumn="0" w:lastRowFirstColumn="0" w:lastRowLastColumn="0"/>
-              <w:rPr>
-                <w:lang w:val="en-PK"/>
-              </w:rPr>
-            </w:pPr>
-            <w:r>
-              <w:rPr>
-                <w:lang w:val="en-PK"/>
-              </w:rPr>
+            </w:pPr>
+            <w:r>
               <w:t xml:space="preserve">Test metrics: {'accuracy': 0.9763488173484802, 'loss': 0.22228938341140747, </w:t>
             </w:r>
             <w:r>
-              <w:rPr>
-                <w:lang w:val="en-PK"/>
-              </w:rPr>
               <w:lastRenderedPageBreak/>
-              <w:t>'</w:t>
-            </w:r>
-            <w:proofErr w:type="spellStart"/>
-            <w:r>
-              <w:rPr>
-                <w:lang w:val="en-PK"/>
-              </w:rPr>
-              <w:t>threshold_metrics</w:t>
-            </w:r>
-            <w:proofErr w:type="spellEnd"/>
-            <w:r>
-              <w:rPr>
-                <w:lang w:val="en-PK"/>
-              </w:rPr>
-              <w:t>': {'threshold': 0.5, '</w:t>
-            </w:r>
-            <w:proofErr w:type="spellStart"/>
-            <w:r>
-              <w:rPr>
-                <w:lang w:val="en-PK"/>
-              </w:rPr>
-              <w:t>tn</w:t>
-            </w:r>
-            <w:proofErr w:type="spellEnd"/>
-            <w:r>
-              <w:rPr>
-                <w:lang w:val="en-PK"/>
-              </w:rPr>
-              <w:t>': 2655, '</w:t>
-            </w:r>
-            <w:proofErr w:type="spellStart"/>
-            <w:r>
-              <w:rPr>
-                <w:lang w:val="en-PK"/>
-              </w:rPr>
-              <w:t>fp</w:t>
-            </w:r>
-            <w:proofErr w:type="spellEnd"/>
-            <w:r>
-              <w:rPr>
-                <w:lang w:val="en-PK"/>
-              </w:rPr>
-              <w:t>': 12214, '</w:t>
-            </w:r>
-            <w:proofErr w:type="spellStart"/>
-            <w:r>
-              <w:rPr>
-                <w:lang w:val="en-PK"/>
-              </w:rPr>
-              <w:t>fn</w:t>
-            </w:r>
-            <w:proofErr w:type="spellEnd"/>
-            <w:r>
-              <w:rPr>
-                <w:lang w:val="en-PK"/>
-              </w:rPr>
-              <w:t>': 414, '</w:t>
-            </w:r>
-            <w:proofErr w:type="spellStart"/>
-            <w:r>
-              <w:rPr>
-                <w:lang w:val="en-PK"/>
-              </w:rPr>
-              <w:t>tp</w:t>
-            </w:r>
-            <w:proofErr w:type="spellEnd"/>
-            <w:r>
-              <w:rPr>
-                <w:lang w:val="en-PK"/>
-              </w:rPr>
-              <w:t>': 518644, 'precision': 0.9769919639526771, 'recall': 0.9992024012730562, 'f1': 0.987972366123636, '</w:t>
-            </w:r>
-            <w:proofErr w:type="spellStart"/>
-            <w:r>
-              <w:rPr>
-                <w:lang w:val="en-PK"/>
-              </w:rPr>
-              <w:t>threshold_accuracy</w:t>
-            </w:r>
-            <w:proofErr w:type="spellEnd"/>
-            <w:r>
-              <w:rPr>
-                <w:lang w:val="en-PK"/>
-              </w:rPr>
-              <w:t>': 0.9763488267122659}}</w:t>
-            </w:r>
-          </w:p>
-          <w:p>
-            <w:pPr>
-              <w:cnfStyle w:val="000000000000" w:firstRow="0" w:lastRow="0" w:firstColumn="0" w:lastColumn="0" w:oddVBand="0" w:evenVBand="0" w:oddHBand="0" w:evenHBand="0" w:firstRowFirstColumn="0" w:firstRowLastColumn="0" w:lastRowFirstColumn="0" w:lastRowLastColumn="0"/>
-              <w:rPr>
-                <w:lang w:val="en-PK"/>
-              </w:rPr>
+              <w:t>'threshold_metrics': {'threshold': 0.5, 'tn': 2655, 'fp': 12214, 'fn': 414, 'tp': 518644, 'precision': 0.9769919639526771, 'recall': 0.9992024012730562, 'f1': 0.987972366123636, 'threshold_accuracy': 0.9763488267122659}}</w:t>
+            </w:r>
+          </w:p>
+          <w:p>
+            <w:pPr>
+              <w:cnfStyle w:val="000000000000" w:firstRow="0" w:lastRow="0" w:firstColumn="0" w:lastColumn="0" w:oddVBand="0" w:evenVBand="0" w:oddHBand="0" w:evenHBand="0" w:firstRowFirstColumn="0" w:firstRowLastColumn="0" w:lastRowFirstColumn="0" w:lastRowLastColumn="0"/>
             </w:pPr>
           </w:p>
         </w:tc>
@@ -627,13 +433,8 @@
             </w:r>
             <w:r>
               <w:br/>
-              <w:t xml:space="preserve">Attention → </w:t>
-            </w:r>
-            <w:proofErr w:type="spellStart"/>
-            <w:r>
-              <w:t>Softmax</w:t>
-            </w:r>
-            <w:proofErr w:type="spellEnd"/>
+              <w:t>Attention → Softmax</w:t>
+            </w:r>
             <w:r>
               <w:br/>
               <w:t>Output → Sigmoid</w:t>
@@ -689,13 +490,8 @@
             </w:r>
             <w:r>
               <w:br/>
-              <w:t xml:space="preserve">Attention → </w:t>
-            </w:r>
-            <w:proofErr w:type="spellStart"/>
-            <w:r>
-              <w:t>Softmax</w:t>
-            </w:r>
-            <w:proofErr w:type="spellEnd"/>
+              <w:t>Attention → Softmax</w:t>
+            </w:r>
             <w:r>
               <w:br/>
               <w:t>Output → Sigmoid</w:t>
@@ -748,13 +544,8 @@
             </w:r>
             <w:r>
               <w:br/>
-              <w:t xml:space="preserve">Attention → </w:t>
-            </w:r>
-            <w:proofErr w:type="spellStart"/>
-            <w:r>
-              <w:t>Softmax</w:t>
-            </w:r>
-            <w:proofErr w:type="spellEnd"/>
+              <w:t>Attention → Softmax</w:t>
+            </w:r>
             <w:r>
               <w:br/>
               <w:t>Output → Sigmoid</w:t>
@@ -810,13 +601,8 @@
             </w:r>
             <w:r>
               <w:br/>
-              <w:t xml:space="preserve">Attention → </w:t>
-            </w:r>
-            <w:proofErr w:type="spellStart"/>
-            <w:r>
-              <w:t>Softmax</w:t>
-            </w:r>
-            <w:proofErr w:type="spellEnd"/>
+              <w:t>Attention → Softmax</w:t>
+            </w:r>
             <w:r>
               <w:br/>
               <w:t>Output → Sigmoid</w:t>
@@ -832,8 +618,204 @@
           <w:bCs/>
           <w:sz w:val="40"/>
           <w:szCs w:val="40"/>
+          <w:lang w:val="en-US"/>
         </w:rPr>
       </w:pPr>
+    </w:p>
+    <w:p>
+      <w:pPr>
+        <w:rPr>
+          <w:b/>
+          <w:bCs/>
+          <w:sz w:val="40"/>
+          <w:szCs w:val="40"/>
+          <w:lang w:val="en-US"/>
+        </w:rPr>
+      </w:pPr>
+    </w:p>
+    <w:p>
+      <w:pPr>
+        <w:rPr>
+          <w:b/>
+          <w:bCs/>
+          <w:lang w:val="en-US"/>
+        </w:rPr>
+      </w:pPr>
+      <w:r>
+        <w:rPr>
+          <w:b/>
+          <w:bCs/>
+          <w:lang w:val="en-US"/>
+        </w:rPr>
+        <w:t>BRANCH: AF_V3</w:t>
+      </w:r>
+    </w:p>
+    <w:p>
+      <w:pPr>
+        <w:rPr>
+          <w:lang w:val="en-US"/>
+        </w:rPr>
+      </w:pPr>
+      <w:r>
+        <w:rPr>
+          <w:lang w:val="en-US"/>
+        </w:rPr>
+        <w:t>AUDIO MODEL:</w:t>
+      </w:r>
+    </w:p>
+    <w:p>
+      <w:pPr>
+        <w:rPr>
+          <w:lang w:val="en-US"/>
+        </w:rPr>
+      </w:pPr>
+      <w:r>
+        <w:rPr>
+          <w:lang w:val="en-US"/>
+        </w:rPr>
+        <w:t xml:space="preserve">  accuracy: 0.9811</w:t>
+      </w:r>
+    </w:p>
+    <w:p>
+      <w:pPr>
+        <w:rPr>
+          <w:lang w:val="en-US"/>
+        </w:rPr>
+      </w:pPr>
+      <w:r>
+        <w:rPr>
+          <w:lang w:val="en-US"/>
+        </w:rPr>
+        <w:t xml:space="preserve">  loss: 0.0519</w:t>
+      </w:r>
+    </w:p>
+    <w:p>
+      <w:pPr>
+        <w:rPr>
+          <w:lang w:val="en-US"/>
+        </w:rPr>
+      </w:pPr>
+      <w:r>
+        <w:rPr>
+          <w:lang w:val="en-US"/>
+        </w:rPr>
+        <w:t xml:space="preserve">  </w:t>
+      </w:r>
+      <w:proofErr w:type="spellStart"/>
+      <w:r>
+        <w:rPr>
+          <w:lang w:val="en-US"/>
+        </w:rPr>
+        <w:t>val_accuracy</w:t>
+      </w:r>
+      <w:proofErr w:type="spellEnd"/>
+      <w:r>
+        <w:rPr>
+          <w:lang w:val="en-US"/>
+        </w:rPr>
+        <w:t>: 0.8934</w:t>
+      </w:r>
+    </w:p>
+    <w:p>
+      <w:pPr>
+        <w:rPr>
+          <w:lang w:val="en-US"/>
+        </w:rPr>
+      </w:pPr>
+      <w:r>
+        <w:rPr>
+          <w:lang w:val="en-US"/>
+        </w:rPr>
+        <w:t xml:space="preserve">  </w:t>
+      </w:r>
+      <w:proofErr w:type="spellStart"/>
+      <w:r>
+        <w:rPr>
+          <w:lang w:val="en-US"/>
+        </w:rPr>
+        <w:t>val_loss</w:t>
+      </w:r>
+      <w:proofErr w:type="spellEnd"/>
+      <w:r>
+        <w:rPr>
+          <w:lang w:val="en-US"/>
+        </w:rPr>
+        <w:t>: 2.1449</w:t>
+      </w:r>
+    </w:p>
+    <w:p>
+      <w:pPr>
+        <w:rPr>
+          <w:lang w:val="en-US"/>
+        </w:rPr>
+      </w:pPr>
+      <w:r>
+        <w:rPr>
+          <w:lang w:val="en-US"/>
+        </w:rPr>
+        <w:t xml:space="preserve">  Test metrics: {'accuracy': 0.9768357872962952, 'loss': 0.23769108951091766}</w:t>
+      </w:r>
+    </w:p>
+    <w:p>
+      <w:pPr>
+        <w:rPr>
+          <w:lang w:val="en-US"/>
+        </w:rPr>
+      </w:pPr>
+      <w:r>
+        <w:rPr>
+          <w:lang w:val="en-US"/>
+        </w:rPr>
+        <w:t>ACTIVATION FUNCTION:</w:t>
+      </w:r>
+    </w:p>
+    <w:p>
+      <w:pPr>
+        <w:rPr>
+          <w:lang w:val="en-US"/>
+        </w:rPr>
+      </w:pPr>
+      <w:r>
+        <w:rPr>
+          <w:lang w:val="en-US"/>
+        </w:rPr>
+        <w:t xml:space="preserve">  MLP → Swish</w:t>
+      </w:r>
+    </w:p>
+    <w:p>
+      <w:pPr>
+        <w:rPr>
+          <w:lang w:val="en-US"/>
+        </w:rPr>
+      </w:pPr>
+      <w:r>
+        <w:rPr>
+          <w:lang w:val="en-US"/>
+        </w:rPr>
+        <w:t xml:space="preserve">  Attention → </w:t>
+      </w:r>
+      <w:proofErr w:type="spellStart"/>
+      <w:r>
+        <w:rPr>
+          <w:lang w:val="en-US"/>
+        </w:rPr>
+        <w:t>Softmax</w:t>
+      </w:r>
+      <w:proofErr w:type="spellEnd"/>
+    </w:p>
+    <w:p>
+      <w:pPr>
+        <w:rPr>
+          <w:lang w:val="en-US"/>
+        </w:rPr>
+      </w:pPr>
+      <w:r>
+        <w:rPr>
+          <w:lang w:val="en-US"/>
+        </w:rPr>
+        <w:lastRenderedPageBreak/>
+        <w:t xml:space="preserve">  Output → Sigmoid</w:t>
+      </w:r>
     </w:p>
     <w:sectPr>
       <w:pgSz w:w="11906" w:h="16838"/>
@@ -904,7 +886,7 @@
         <w:kern w:val="2"/>
         <w:sz w:val="24"/>
         <w:szCs w:val="24"/>
-        <w:lang w:val="en-PK" w:eastAsia="en-US" w:bidi="ar-SA"/>
+        <w:lang w:eastAsia="en-US" w:bidi="ar-SA"/>
         <w14:ligatures w14:val="standardContextual"/>
       </w:rPr>
     </w:rPrDefault>
@@ -1498,6 +1480,7 @@
   <w:style w:type="character" w:default="1" w:styleId="DefaultParagraphFont">
     <w:name w:val="Default Paragraph Font"/>
     <w:uiPriority w:val="1"/>
+    <w:semiHidden/>
     <w:unhideWhenUsed/>
   </w:style>
   <w:style w:type="table" w:default="1" w:styleId="TableNormal">

</xml_diff>

<commit_message>
AF_V4: Added Kaggle training results
</commit_message>
<xml_diff>
--- a/Research_Results.docx
+++ b/Research_Results.docx
@@ -1,6 +1,6 @@
 
 <file path=word/document.xml><?xml version="1.0" encoding="utf-8"?>
-<w:document xmlns:wpc="http://schemas.microsoft.com/office/word/2010/wordprocessingCanvas" xmlns:cx="http://schemas.microsoft.com/office/drawing/2014/chartex" xmlns:cx1="http://schemas.microsoft.com/office/drawing/2015/9/8/chartex" xmlns:cx2="http://schemas.microsoft.com/office/drawing/2015/10/21/chartex" xmlns:cx3="http://schemas.microsoft.com/office/drawing/2016/5/9/chartex" xmlns:cx4="http://schemas.microsoft.com/office/drawing/2016/5/10/chartex" xmlns:cx5="http://schemas.microsoft.com/office/drawing/2016/5/11/chartex" xmlns:cx6="http://schemas.microsoft.com/office/drawing/2016/5/12/chartex" xmlns:cx7="http://schemas.microsoft.com/office/drawing/2016/5/13/chartex" xmlns:cx8="http://schemas.microsoft.com/office/drawing/2016/5/14/chartex" xmlns:mc="http://schemas.openxmlformats.org/markup-compatibility/2006" xmlns:aink="http://schemas.microsoft.com/office/drawing/2016/ink" xmlns:am3d="http://schemas.microsoft.com/office/drawing/2017/model3d" xmlns:o="urn:schemas-microsoft-com:office:office" xmlns:oel="http://schemas.microsoft.com/office/2019/extlst" xmlns:r="http://schemas.openxmlformats.org/officeDocument/2006/relationships" xmlns:m="http://schemas.openxmlformats.org/officeDocument/2006/math" xmlns:v="urn:schemas-microsoft-com:vml" xmlns:wp14="http://schemas.microsoft.com/office/word/2010/wordprocessingDrawing" xmlns:wp="http://schemas.openxmlformats.org/drawingml/2006/wordprocessingDrawing" xmlns:w10="urn:schemas-microsoft-com:office:word" xmlns:w="http://schemas.openxmlformats.org/wordprocessingml/2006/main" xmlns:w14="http://schemas.microsoft.com/office/word/2010/wordml" xmlns:w15="http://schemas.microsoft.com/office/word/2012/wordml" xmlns:w16cex="http://schemas.microsoft.com/office/word/2018/wordml/cex" xmlns:w16cid="http://schemas.microsoft.com/office/word/2016/wordml/cid" xmlns:w16="http://schemas.microsoft.com/office/word/2018/wordml" xmlns:w16sdtdh="http://schemas.microsoft.com/office/word/2020/wordml/sdtdatahash" xmlns:w16se="http://schemas.microsoft.com/office/word/2015/wordml/symex" xmlns:wpg="http://schemas.microsoft.com/office/word/2010/wordprocessingGroup" xmlns:wpi="http://schemas.microsoft.com/office/word/2010/wordprocessingInk" xmlns:wne="http://schemas.microsoft.com/office/word/2006/wordml" xmlns:wps="http://schemas.microsoft.com/office/word/2010/wordprocessingShape" mc:Ignorable="w14 w15 w16se w16cid w16 w16cex w16sdtdh wp14">
+<w:document xmlns:wpc="http://schemas.microsoft.com/office/word/2010/wordprocessingCanvas" xmlns:cx="http://schemas.microsoft.com/office/drawing/2014/chartex" xmlns:cx1="http://schemas.microsoft.com/office/drawing/2015/9/8/chartex" xmlns:cx2="http://schemas.microsoft.com/office/drawing/2015/10/21/chartex" xmlns:cx3="http://schemas.microsoft.com/office/drawing/2016/5/9/chartex" xmlns:cx4="http://schemas.microsoft.com/office/drawing/2016/5/10/chartex" xmlns:cx5="http://schemas.microsoft.com/office/drawing/2016/5/11/chartex" xmlns:cx6="http://schemas.microsoft.com/office/drawing/2016/5/12/chartex" xmlns:cx7="http://schemas.microsoft.com/office/drawing/2016/5/13/chartex" xmlns:cx8="http://schemas.microsoft.com/office/drawing/2016/5/14/chartex" xmlns:mc="http://schemas.openxmlformats.org/markup-compatibility/2006" xmlns:aink="http://schemas.microsoft.com/office/drawing/2016/ink" xmlns:am3d="http://schemas.microsoft.com/office/drawing/2017/model3d" xmlns:o="urn:schemas-microsoft-com:office:office" xmlns:oel="http://schemas.microsoft.com/office/2019/extlst" xmlns:r="http://schemas.openxmlformats.org/officeDocument/2006/relationships" xmlns:m="http://schemas.openxmlformats.org/officeDocument/2006/math" xmlns:v="urn:schemas-microsoft-com:vml" xmlns:wp14="http://schemas.microsoft.com/office/word/2010/wordprocessingDrawing" xmlns:wp="http://schemas.openxmlformats.org/drawingml/2006/wordprocessingDrawing" xmlns:w10="urn:schemas-microsoft-com:office:word" xmlns:w="http://schemas.openxmlformats.org/wordprocessingml/2006/main" xmlns:w14="http://schemas.microsoft.com/office/word/2010/wordml" xmlns:w15="http://schemas.microsoft.com/office/word/2012/wordml" xmlns:w16cex="http://schemas.microsoft.com/office/word/2018/wordml/cex" xmlns:w16cid="http://schemas.microsoft.com/office/word/2016/wordml/cid" xmlns:w16="http://schemas.microsoft.com/office/word/2018/wordml" xmlns:w16du="http://schemas.microsoft.com/office/word/2023/wordml/word16du" xmlns:w16sdtdh="http://schemas.microsoft.com/office/word/2020/wordml/sdtdatahash" xmlns:w16sdtfl="http://schemas.microsoft.com/office/word/2024/wordml/sdtformatlock" xmlns:w16se="http://schemas.microsoft.com/office/word/2015/wordml/symex" xmlns:wpg="http://schemas.microsoft.com/office/word/2010/wordprocessingGroup" xmlns:wpi="http://schemas.microsoft.com/office/word/2010/wordprocessingInk" xmlns:wne="http://schemas.microsoft.com/office/word/2006/wordml" xmlns:wps="http://schemas.microsoft.com/office/word/2010/wordprocessingShape" mc:Ignorable="w14 w15 w16se w16cid w16 w16cex w16sdtdh w16sdtfl w16du wp14">
   <w:body>
     <w:tbl>
       <w:tblPr>
@@ -10,10 +10,10 @@
         <w:tblLook w:val="04A0" w:firstRow="1" w:lastRow="0" w:firstColumn="1" w:lastColumn="0" w:noHBand="0" w:noVBand="1"/>
       </w:tblPr>
       <w:tblGrid>
-        <w:gridCol w:w="1923"/>
-        <w:gridCol w:w="2407"/>
+        <w:gridCol w:w="1847"/>
+        <w:gridCol w:w="2535"/>
         <w:gridCol w:w="2663"/>
-        <w:gridCol w:w="2033"/>
+        <w:gridCol w:w="1981"/>
       </w:tblGrid>
       <w:tr>
         <w:trPr>
@@ -109,26 +109,16 @@
             <w:pPr>
               <w:cnfStyle w:val="000000100000" w:firstRow="0" w:lastRow="0" w:firstColumn="0" w:lastColumn="0" w:oddVBand="0" w:evenVBand="0" w:oddHBand="1" w:evenHBand="0" w:firstRowFirstColumn="0" w:firstRowLastColumn="0" w:lastRowFirstColumn="0" w:lastRowLastColumn="0"/>
             </w:pPr>
-            <w:proofErr w:type="spellStart"/>
-            <w:r>
-              <w:t>val_accuracy</w:t>
-            </w:r>
-            <w:proofErr w:type="spellEnd"/>
-            <w:r>
-              <w:t>: 0.5000</w:t>
-            </w:r>
-          </w:p>
-          <w:p>
-            <w:pPr>
-              <w:cnfStyle w:val="000000100000" w:firstRow="0" w:lastRow="0" w:firstColumn="0" w:lastColumn="0" w:oddVBand="0" w:evenVBand="0" w:oddHBand="1" w:evenHBand="0" w:firstRowFirstColumn="0" w:firstRowLastColumn="0" w:lastRowFirstColumn="0" w:lastRowLastColumn="0"/>
-            </w:pPr>
-            <w:proofErr w:type="spellStart"/>
-            <w:r>
-              <w:t>val_loss</w:t>
-            </w:r>
-            <w:proofErr w:type="spellEnd"/>
-            <w:r>
-              <w:t>: 2.9069</w:t>
+            <w:r>
+              <w:t>val_accuracy: 0.5000</w:t>
+            </w:r>
+          </w:p>
+          <w:p>
+            <w:pPr>
+              <w:cnfStyle w:val="000000100000" w:firstRow="0" w:lastRow="0" w:firstColumn="0" w:lastColumn="0" w:oddVBand="0" w:evenVBand="0" w:oddHBand="1" w:evenHBand="0" w:firstRowFirstColumn="0" w:firstRowLastColumn="0" w:lastRowFirstColumn="0" w:lastRowLastColumn="0"/>
+            </w:pPr>
+            <w:r>
+              <w:t>val_loss: 2.9069</w:t>
             </w:r>
           </w:p>
         </w:tc>
@@ -149,28 +139,15 @@
               <w:cnfStyle w:val="000000100000" w:firstRow="0" w:lastRow="0" w:firstColumn="0" w:lastColumn="0" w:oddVBand="0" w:evenVBand="0" w:oddHBand="1" w:evenHBand="0" w:firstRowFirstColumn="0" w:firstRowLastColumn="0" w:lastRowFirstColumn="0" w:lastRowLastColumn="0"/>
             </w:pPr>
             <w:r>
-              <w:t xml:space="preserve">loss: 0.1201 </w:t>
-            </w:r>
-            <w:proofErr w:type="spellStart"/>
-            <w:r>
-              <w:t>val_accuracy</w:t>
-            </w:r>
-            <w:proofErr w:type="spellEnd"/>
-            <w:r>
-              <w:t>: 0.8934</w:t>
-            </w:r>
-          </w:p>
-          <w:p>
-            <w:pPr>
-              <w:cnfStyle w:val="000000100000" w:firstRow="0" w:lastRow="0" w:firstColumn="0" w:lastColumn="0" w:oddVBand="0" w:evenVBand="0" w:oddHBand="1" w:evenHBand="0" w:firstRowFirstColumn="0" w:firstRowLastColumn="0" w:lastRowFirstColumn="0" w:lastRowLastColumn="0"/>
-            </w:pPr>
-            <w:proofErr w:type="spellStart"/>
-            <w:r>
-              <w:t>val_loss</w:t>
-            </w:r>
-            <w:proofErr w:type="spellEnd"/>
-            <w:r>
-              <w:t>: 1.7475</w:t>
+              <w:t>loss: 0.1201 val_accuracy: 0.8934</w:t>
+            </w:r>
+          </w:p>
+          <w:p>
+            <w:pPr>
+              <w:cnfStyle w:val="000000100000" w:firstRow="0" w:lastRow="0" w:firstColumn="0" w:lastColumn="0" w:oddVBand="0" w:evenVBand="0" w:oddHBand="1" w:evenHBand="0" w:firstRowFirstColumn="0" w:firstRowLastColumn="0" w:lastRowFirstColumn="0" w:lastRowLastColumn="0"/>
+            </w:pPr>
+            <w:r>
+              <w:t>val_loss: 1.7475</w:t>
             </w:r>
           </w:p>
           <w:p>
@@ -210,13 +187,8 @@
               <w:cnfStyle w:val="000000100000" w:firstRow="0" w:lastRow="0" w:firstColumn="0" w:lastColumn="0" w:oddVBand="0" w:evenVBand="0" w:oddHBand="1" w:evenHBand="0" w:firstRowFirstColumn="0" w:firstRowLastColumn="0" w:lastRowFirstColumn="0" w:lastRowLastColumn="0"/>
             </w:pPr>
             <w:r>
-              <w:t xml:space="preserve">Attention - </w:t>
-            </w:r>
-            <w:proofErr w:type="spellStart"/>
-            <w:r>
-              <w:t>softmax</w:t>
-            </w:r>
-            <w:proofErr w:type="spellEnd"/>
+              <w:t>Attention - softmax</w:t>
+            </w:r>
           </w:p>
           <w:p>
             <w:pPr>
@@ -226,13 +198,8 @@
               <w:t>O</w:t>
             </w:r>
             <w:r>
-              <w:t xml:space="preserve">utput – </w:t>
-            </w:r>
-            <w:proofErr w:type="spellStart"/>
-            <w:r>
-              <w:t>softmax</w:t>
-            </w:r>
-            <w:proofErr w:type="spellEnd"/>
+              <w:t>utput – softmax</w:t>
+            </w:r>
           </w:p>
           <w:p>
             <w:pPr>
@@ -269,13 +236,8 @@
             <w:pPr>
               <w:cnfStyle w:val="000000000000" w:firstRow="0" w:lastRow="0" w:firstColumn="0" w:lastColumn="0" w:oddVBand="0" w:evenVBand="0" w:oddHBand="0" w:evenHBand="0" w:firstRowFirstColumn="0" w:firstRowLastColumn="0" w:lastRowFirstColumn="0" w:lastRowLastColumn="0"/>
             </w:pPr>
-            <w:proofErr w:type="spellStart"/>
-            <w:r>
-              <w:t>val_accuracy</w:t>
-            </w:r>
-            <w:proofErr w:type="spellEnd"/>
-            <w:r>
-              <w:t>: 0.5000</w:t>
+            <w:r>
+              <w:t>val_accuracy: 0.5000</w:t>
             </w:r>
           </w:p>
           <w:p>
@@ -357,13 +319,8 @@
             <w:r>
               <w:br/>
             </w:r>
-            <w:proofErr w:type="spellStart"/>
-            <w:r>
-              <w:t>val_accuracy</w:t>
-            </w:r>
-            <w:proofErr w:type="spellEnd"/>
-            <w:r>
-              <w:t>: 0.8934</w:t>
+            <w:r>
+              <w:t>val_accuracy: 0.8934</w:t>
             </w:r>
           </w:p>
           <w:p>
@@ -382,234 +339,83 @@
           <w:p>
             <w:pPr>
               <w:cnfStyle w:val="000000000000" w:firstRow="0" w:lastRow="0" w:firstColumn="0" w:lastColumn="0" w:oddVBand="0" w:evenVBand="0" w:oddHBand="0" w:evenHBand="0" w:firstRowFirstColumn="0" w:firstRowLastColumn="0" w:lastRowFirstColumn="0" w:lastRowLastColumn="0"/>
-              <w:rPr>
-                <w:lang w:val="en-PK"/>
-              </w:rPr>
             </w:pPr>
             <w:r>
               <w:rPr>
                 <w:rFonts w:ascii="Segoe UI Emoji" w:hAnsi="Segoe UI Emoji" w:cs="Segoe UI Emoji"/>
-                <w:lang w:val="en-PK"/>
               </w:rPr>
               <w:t>📌</w:t>
             </w:r>
             <w:r>
-              <w:rPr>
-                <w:lang w:val="en-PK"/>
-              </w:rPr>
               <w:t xml:space="preserve"> Threshold metrics @ 0.50</w:t>
             </w:r>
           </w:p>
           <w:p>
             <w:pPr>
               <w:cnfStyle w:val="000000000000" w:firstRow="0" w:lastRow="0" w:firstColumn="0" w:lastColumn="0" w:oddVBand="0" w:evenVBand="0" w:oddHBand="0" w:evenHBand="0" w:firstRowFirstColumn="0" w:firstRowLastColumn="0" w:lastRowFirstColumn="0" w:lastRowLastColumn="0"/>
-              <w:rPr>
-                <w:lang w:val="en-PK"/>
-              </w:rPr>
-            </w:pPr>
-            <w:r>
-              <w:rPr>
-                <w:lang w:val="en-PK"/>
-              </w:rPr>
+            </w:pPr>
+            <w:r>
               <w:t>Confusion Matrix [[TN, FP], [FN, TP]]:</w:t>
             </w:r>
           </w:p>
           <w:p>
             <w:pPr>
               <w:cnfStyle w:val="000000000000" w:firstRow="0" w:lastRow="0" w:firstColumn="0" w:lastColumn="0" w:oddVBand="0" w:evenVBand="0" w:oddHBand="0" w:evenHBand="0" w:firstRowFirstColumn="0" w:firstRowLastColumn="0" w:lastRowFirstColumn="0" w:lastRowLastColumn="0"/>
-              <w:rPr>
-                <w:lang w:val="en-PK"/>
-              </w:rPr>
-            </w:pPr>
-            <w:r>
-              <w:rPr>
-                <w:lang w:val="en-PK"/>
-              </w:rPr>
-              <w:t>[</w:t>
-            </w:r>
-            <w:proofErr w:type="gramStart"/>
-            <w:r>
-              <w:rPr>
-                <w:lang w:val="en-PK"/>
-              </w:rPr>
-              <w:t>[  2655</w:t>
-            </w:r>
-            <w:proofErr w:type="gramEnd"/>
-            <w:r>
-              <w:rPr>
-                <w:lang w:val="en-PK"/>
-              </w:rPr>
-              <w:t xml:space="preserve">  12214]</w:t>
-            </w:r>
-          </w:p>
-          <w:p>
-            <w:pPr>
-              <w:cnfStyle w:val="000000000000" w:firstRow="0" w:lastRow="0" w:firstColumn="0" w:lastColumn="0" w:oddVBand="0" w:evenVBand="0" w:oddHBand="0" w:evenHBand="0" w:firstRowFirstColumn="0" w:firstRowLastColumn="0" w:lastRowFirstColumn="0" w:lastRowLastColumn="0"/>
-              <w:rPr>
-                <w:lang w:val="en-PK"/>
-              </w:rPr>
-            </w:pPr>
-            <w:r>
-              <w:rPr>
-                <w:lang w:val="en-PK"/>
-              </w:rPr>
+            </w:pPr>
+            <w:r>
+              <w:t>[[  2655  12214]</w:t>
+            </w:r>
+          </w:p>
+          <w:p>
+            <w:pPr>
+              <w:cnfStyle w:val="000000000000" w:firstRow="0" w:lastRow="0" w:firstColumn="0" w:lastColumn="0" w:oddVBand="0" w:evenVBand="0" w:oddHBand="0" w:evenHBand="0" w:firstRowFirstColumn="0" w:firstRowLastColumn="0" w:lastRowFirstColumn="0" w:lastRowLastColumn="0"/>
+            </w:pPr>
+            <w:r>
               <w:t xml:space="preserve"> [   414 518644]]</w:t>
             </w:r>
           </w:p>
           <w:p>
             <w:pPr>
               <w:cnfStyle w:val="000000000000" w:firstRow="0" w:lastRow="0" w:firstColumn="0" w:lastColumn="0" w:oddVBand="0" w:evenVBand="0" w:oddHBand="0" w:evenHBand="0" w:firstRowFirstColumn="0" w:firstRowLastColumn="0" w:lastRowFirstColumn="0" w:lastRowLastColumn="0"/>
-              <w:rPr>
-                <w:lang w:val="en-PK"/>
-              </w:rPr>
-            </w:pPr>
-            <w:r>
-              <w:rPr>
-                <w:lang w:val="en-PK"/>
-              </w:rPr>
+            </w:pPr>
+            <w:r>
               <w:t>Precision: 0.9770 | Recall: 0.9992 | F1: 0.9880 | Accuracy: 0.9763</w:t>
             </w:r>
           </w:p>
           <w:p>
             <w:pPr>
               <w:cnfStyle w:val="000000000000" w:firstRow="0" w:lastRow="0" w:firstColumn="0" w:lastColumn="0" w:oddVBand="0" w:evenVBand="0" w:oddHBand="0" w:evenHBand="0" w:firstRowFirstColumn="0" w:firstRowLastColumn="0" w:lastRowFirstColumn="0" w:lastRowLastColumn="0"/>
-              <w:rPr>
-                <w:lang w:val="en-PK"/>
-              </w:rPr>
-            </w:pPr>
-          </w:p>
-          <w:p>
-            <w:pPr>
-              <w:cnfStyle w:val="000000000000" w:firstRow="0" w:lastRow="0" w:firstColumn="0" w:lastColumn="0" w:oddVBand="0" w:evenVBand="0" w:oddHBand="0" w:evenHBand="0" w:firstRowFirstColumn="0" w:firstRowLastColumn="0" w:lastRowFirstColumn="0" w:lastRowLastColumn="0"/>
-              <w:rPr>
-                <w:lang w:val="en-PK"/>
-              </w:rPr>
+            </w:pPr>
+          </w:p>
+          <w:p>
+            <w:pPr>
+              <w:cnfStyle w:val="000000000000" w:firstRow="0" w:lastRow="0" w:firstColumn="0" w:lastColumn="0" w:oddVBand="0" w:evenVBand="0" w:oddHBand="0" w:evenHBand="0" w:firstRowFirstColumn="0" w:firstRowLastColumn="0" w:lastRowFirstColumn="0" w:lastRowLastColumn="0"/>
             </w:pPr>
             <w:r>
               <w:rPr>
                 <w:rFonts w:ascii="Segoe UI Emoji" w:hAnsi="Segoe UI Emoji" w:cs="Segoe UI Emoji"/>
-                <w:lang w:val="en-PK"/>
               </w:rPr>
               <w:t>✅</w:t>
             </w:r>
             <w:r>
-              <w:rPr>
-                <w:lang w:val="en-PK"/>
-              </w:rPr>
               <w:t xml:space="preserve"> Audio training session completed with the latest repository code.</w:t>
             </w:r>
           </w:p>
           <w:p>
             <w:pPr>
               <w:cnfStyle w:val="000000000000" w:firstRow="0" w:lastRow="0" w:firstColumn="0" w:lastColumn="0" w:oddVBand="0" w:evenVBand="0" w:oddHBand="0" w:evenHBand="0" w:firstRowFirstColumn="0" w:firstRowLastColumn="0" w:lastRowFirstColumn="0" w:lastRowLastColumn="0"/>
-              <w:rPr>
-                <w:lang w:val="en-PK"/>
-              </w:rPr>
-            </w:pPr>
-            <w:r>
-              <w:rPr>
-                <w:lang w:val="en-PK"/>
-              </w:rPr>
+            </w:pPr>
+            <w:r>
               <w:t xml:space="preserve">Test metrics: {'accuracy': 0.9763488173484802, 'loss': 0.22228938341140747, </w:t>
             </w:r>
             <w:r>
-              <w:rPr>
-                <w:lang w:val="en-PK"/>
-              </w:rPr>
               <w:lastRenderedPageBreak/>
-              <w:t>'</w:t>
-            </w:r>
-            <w:proofErr w:type="spellStart"/>
-            <w:r>
-              <w:rPr>
-                <w:lang w:val="en-PK"/>
-              </w:rPr>
-              <w:t>threshold_metrics</w:t>
-            </w:r>
-            <w:proofErr w:type="spellEnd"/>
-            <w:r>
-              <w:rPr>
-                <w:lang w:val="en-PK"/>
-              </w:rPr>
-              <w:t>': {'threshold': 0.5, '</w:t>
-            </w:r>
-            <w:proofErr w:type="spellStart"/>
-            <w:r>
-              <w:rPr>
-                <w:lang w:val="en-PK"/>
-              </w:rPr>
-              <w:t>tn</w:t>
-            </w:r>
-            <w:proofErr w:type="spellEnd"/>
-            <w:r>
-              <w:rPr>
-                <w:lang w:val="en-PK"/>
-              </w:rPr>
-              <w:t>': 2655, '</w:t>
-            </w:r>
-            <w:proofErr w:type="spellStart"/>
-            <w:r>
-              <w:rPr>
-                <w:lang w:val="en-PK"/>
-              </w:rPr>
-              <w:t>fp</w:t>
-            </w:r>
-            <w:proofErr w:type="spellEnd"/>
-            <w:r>
-              <w:rPr>
-                <w:lang w:val="en-PK"/>
-              </w:rPr>
-              <w:t>': 12214, '</w:t>
-            </w:r>
-            <w:proofErr w:type="spellStart"/>
-            <w:r>
-              <w:rPr>
-                <w:lang w:val="en-PK"/>
-              </w:rPr>
-              <w:t>fn</w:t>
-            </w:r>
-            <w:proofErr w:type="spellEnd"/>
-            <w:r>
-              <w:rPr>
-                <w:lang w:val="en-PK"/>
-              </w:rPr>
-              <w:t>': 414, '</w:t>
-            </w:r>
-            <w:proofErr w:type="spellStart"/>
-            <w:r>
-              <w:rPr>
-                <w:lang w:val="en-PK"/>
-              </w:rPr>
-              <w:t>tp</w:t>
-            </w:r>
-            <w:proofErr w:type="spellEnd"/>
-            <w:r>
-              <w:rPr>
-                <w:lang w:val="en-PK"/>
-              </w:rPr>
-              <w:t>': 518644, 'precision': 0.9769919639526771, 'recall': 0.9992024012730562, 'f1': 0.987972366123636, '</w:t>
-            </w:r>
-            <w:proofErr w:type="spellStart"/>
-            <w:r>
-              <w:rPr>
-                <w:lang w:val="en-PK"/>
-              </w:rPr>
-              <w:t>threshold_accuracy</w:t>
-            </w:r>
-            <w:proofErr w:type="spellEnd"/>
-            <w:r>
-              <w:rPr>
-                <w:lang w:val="en-PK"/>
-              </w:rPr>
-              <w:t>': 0.9763488267122659}}</w:t>
-            </w:r>
-          </w:p>
-          <w:p>
-            <w:pPr>
-              <w:cnfStyle w:val="000000000000" w:firstRow="0" w:lastRow="0" w:firstColumn="0" w:lastColumn="0" w:oddVBand="0" w:evenVBand="0" w:oddHBand="0" w:evenHBand="0" w:firstRowFirstColumn="0" w:firstRowLastColumn="0" w:lastRowFirstColumn="0" w:lastRowLastColumn="0"/>
-              <w:rPr>
-                <w:lang w:val="en-PK"/>
-              </w:rPr>
+              <w:t>'threshold_metrics': {'threshold': 0.5, 'tn': 2655, 'fp': 12214, 'fn': 414, 'tp': 518644, 'precision': 0.9769919639526771, 'recall': 0.9992024012730562, 'f1': 0.987972366123636, 'threshold_accuracy': 0.9763488267122659}}</w:t>
+            </w:r>
+          </w:p>
+          <w:p>
+            <w:pPr>
+              <w:cnfStyle w:val="000000000000" w:firstRow="0" w:lastRow="0" w:firstColumn="0" w:lastColumn="0" w:oddVBand="0" w:evenVBand="0" w:oddHBand="0" w:evenHBand="0" w:firstRowFirstColumn="0" w:firstRowLastColumn="0" w:lastRowFirstColumn="0" w:lastRowLastColumn="0"/>
             </w:pPr>
           </w:p>
         </w:tc>
@@ -627,13 +433,8 @@
             </w:r>
             <w:r>
               <w:br/>
-              <w:t xml:space="preserve">Attention → </w:t>
-            </w:r>
-            <w:proofErr w:type="spellStart"/>
-            <w:r>
-              <w:t>Softmax</w:t>
-            </w:r>
-            <w:proofErr w:type="spellEnd"/>
+              <w:t>Attention → Softmax</w:t>
+            </w:r>
             <w:r>
               <w:br/>
               <w:t>Output → Sigmoid</w:t>
@@ -689,13 +490,8 @@
             </w:r>
             <w:r>
               <w:br/>
-              <w:t xml:space="preserve">Attention → </w:t>
-            </w:r>
-            <w:proofErr w:type="spellStart"/>
-            <w:r>
-              <w:t>Softmax</w:t>
-            </w:r>
-            <w:proofErr w:type="spellEnd"/>
+              <w:t>Attention → Softmax</w:t>
+            </w:r>
             <w:r>
               <w:br/>
               <w:t>Output → Sigmoid</w:t>
@@ -748,13 +544,8 @@
             </w:r>
             <w:r>
               <w:br/>
-              <w:t xml:space="preserve">Attention → </w:t>
-            </w:r>
-            <w:proofErr w:type="spellStart"/>
-            <w:r>
-              <w:t>Softmax</w:t>
-            </w:r>
-            <w:proofErr w:type="spellEnd"/>
+              <w:t>Attention → Softmax</w:t>
+            </w:r>
             <w:r>
               <w:br/>
               <w:t>Output → Sigmoid</w:t>
@@ -784,7 +575,158 @@
           <w:p>
             <w:pPr>
               <w:cnfStyle w:val="000000100000" w:firstRow="0" w:lastRow="0" w:firstColumn="0" w:lastColumn="0" w:oddVBand="0" w:evenVBand="0" w:oddHBand="1" w:evenHBand="0" w:firstRowFirstColumn="0" w:firstRowLastColumn="0" w:lastRowFirstColumn="0" w:lastRowLastColumn="0"/>
-            </w:pPr>
+              <w:rPr>
+                <w:lang w:val="en-US"/>
+              </w:rPr>
+            </w:pPr>
+            <w:r>
+              <w:rPr>
+                <w:lang w:val="en-US"/>
+              </w:rPr>
+              <w:t xml:space="preserve">accuracy: 0.1539 </w:t>
+            </w:r>
+          </w:p>
+          <w:p>
+            <w:pPr>
+              <w:cnfStyle w:val="000000100000" w:firstRow="0" w:lastRow="0" w:firstColumn="0" w:lastColumn="0" w:oddVBand="0" w:evenVBand="0" w:oddHBand="1" w:evenHBand="0" w:firstRowFirstColumn="0" w:firstRowLastColumn="0" w:lastRowFirstColumn="0" w:lastRowLastColumn="0"/>
+              <w:rPr>
+                <w:lang w:val="en-US"/>
+              </w:rPr>
+            </w:pPr>
+            <w:r>
+              <w:rPr>
+                <w:lang w:val="en-US"/>
+              </w:rPr>
+              <w:t>loss: 4.0294</w:t>
+            </w:r>
+          </w:p>
+          <w:p>
+            <w:pPr>
+              <w:cnfStyle w:val="000000100000" w:firstRow="0" w:lastRow="0" w:firstColumn="0" w:lastColumn="0" w:oddVBand="0" w:evenVBand="0" w:oddHBand="1" w:evenHBand="0" w:firstRowFirstColumn="0" w:firstRowLastColumn="0" w:lastRowFirstColumn="0" w:lastRowLastColumn="0"/>
+              <w:rPr>
+                <w:lang w:val="en-US"/>
+              </w:rPr>
+            </w:pPr>
+            <w:proofErr w:type="spellStart"/>
+            <w:r>
+              <w:rPr>
+                <w:lang w:val="en-US"/>
+              </w:rPr>
+              <w:t>val_accuracy</w:t>
+            </w:r>
+            <w:proofErr w:type="spellEnd"/>
+            <w:r>
+              <w:rPr>
+                <w:lang w:val="en-US"/>
+              </w:rPr>
+              <w:t xml:space="preserve">: 0.5000  </w:t>
+            </w:r>
+            <w:proofErr w:type="spellStart"/>
+            <w:r>
+              <w:rPr>
+                <w:lang w:val="en-US"/>
+              </w:rPr>
+              <w:t>val_loss</w:t>
+            </w:r>
+            <w:proofErr w:type="spellEnd"/>
+            <w:r>
+              <w:rPr>
+                <w:lang w:val="en-US"/>
+              </w:rPr>
+              <w:t>: 2.3847</w:t>
+            </w:r>
+          </w:p>
+          <w:p>
+            <w:pPr>
+              <w:cnfStyle w:val="000000100000" w:firstRow="0" w:lastRow="0" w:firstColumn="0" w:lastColumn="0" w:oddVBand="0" w:evenVBand="0" w:oddHBand="1" w:evenHBand="0" w:firstRowFirstColumn="0" w:firstRowLastColumn="0" w:lastRowFirstColumn="0" w:lastRowLastColumn="0"/>
+              <w:rPr>
+                <w:lang w:val="en-US"/>
+              </w:rPr>
+            </w:pPr>
+          </w:p>
+          <w:p>
+            <w:pPr>
+              <w:cnfStyle w:val="000000100000" w:firstRow="0" w:lastRow="0" w:firstColumn="0" w:lastColumn="0" w:oddVBand="0" w:evenVBand="0" w:oddHBand="1" w:evenHBand="0" w:firstRowFirstColumn="0" w:firstRowLastColumn="0" w:lastRowFirstColumn="0" w:lastRowLastColumn="0"/>
+            </w:pPr>
+            <w:r>
+              <w:t>Test metrics: {'accuracy': 0.5, 'loss': 2.3846848011016846}</w:t>
+            </w:r>
+          </w:p>
+          <w:p>
+            <w:pPr>
+              <w:cnfStyle w:val="000000100000" w:firstRow="0" w:lastRow="0" w:firstColumn="0" w:lastColumn="0" w:oddVBand="0" w:evenVBand="0" w:oddHBand="1" w:evenHBand="0" w:firstRowFirstColumn="0" w:firstRowLastColumn="0" w:lastRowFirstColumn="0" w:lastRowLastColumn="0"/>
+              <w:rPr>
+                <w:lang w:val="en-US"/>
+              </w:rPr>
+            </w:pPr>
+          </w:p>
+          <w:p>
+            <w:pPr>
+              <w:cnfStyle w:val="000000100000" w:firstRow="0" w:lastRow="0" w:firstColumn="0" w:lastColumn="0" w:oddVBand="0" w:evenVBand="0" w:oddHBand="1" w:evenHBand="0" w:firstRowFirstColumn="0" w:firstRowLastColumn="0" w:lastRowFirstColumn="0" w:lastRowLastColumn="0"/>
+            </w:pPr>
+            <w:r>
+              <w:rPr>
+                <w:rFonts w:ascii="Segoe UI Emoji" w:hAnsi="Segoe UI Emoji" w:cs="Segoe UI Emoji"/>
+              </w:rPr>
+              <w:t>📌</w:t>
+            </w:r>
+            <w:r>
+              <w:t xml:space="preserve"> Threshold metrics @ 0.50</w:t>
+            </w:r>
+          </w:p>
+          <w:p>
+            <w:pPr>
+              <w:cnfStyle w:val="000000100000" w:firstRow="0" w:lastRow="0" w:firstColumn="0" w:lastColumn="0" w:oddVBand="0" w:evenVBand="0" w:oddHBand="1" w:evenHBand="0" w:firstRowFirstColumn="0" w:firstRowLastColumn="0" w:lastRowFirstColumn="0" w:lastRowLastColumn="0"/>
+            </w:pPr>
+            <w:r>
+              <w:t>Confusion Matrix [[TN, FP], [FN, TP]]:</w:t>
+            </w:r>
+          </w:p>
+          <w:p>
+            <w:pPr>
+              <w:cnfStyle w:val="000000100000" w:firstRow="0" w:lastRow="0" w:firstColumn="0" w:lastColumn="0" w:oddVBand="0" w:evenVBand="0" w:oddHBand="1" w:evenHBand="0" w:firstRowFirstColumn="0" w:firstRowLastColumn="0" w:lastRowFirstColumn="0" w:lastRowLastColumn="0"/>
+            </w:pPr>
+            <w:r>
+              <w:t>[[    0 10000]</w:t>
+            </w:r>
+          </w:p>
+          <w:p>
+            <w:pPr>
+              <w:cnfStyle w:val="000000100000" w:firstRow="0" w:lastRow="0" w:firstColumn="0" w:lastColumn="0" w:oddVBand="0" w:evenVBand="0" w:oddHBand="1" w:evenHBand="0" w:firstRowFirstColumn="0" w:firstRowLastColumn="0" w:lastRowFirstColumn="0" w:lastRowLastColumn="0"/>
+            </w:pPr>
+            <w:r>
+              <w:t xml:space="preserve"> [    0 10000]]</w:t>
+            </w:r>
+          </w:p>
+          <w:p>
+            <w:pPr>
+              <w:cnfStyle w:val="000000100000" w:firstRow="0" w:lastRow="0" w:firstColumn="0" w:lastColumn="0" w:oddVBand="0" w:evenVBand="0" w:oddHBand="1" w:evenHBand="0" w:firstRowFirstColumn="0" w:firstRowLastColumn="0" w:lastRowFirstColumn="0" w:lastRowLastColumn="0"/>
+              <w:rPr>
+                <w:lang w:val="en-US"/>
+              </w:rPr>
+            </w:pPr>
+            <w:r>
+              <w:t xml:space="preserve">Precision: 0.5000  Recall: 1.0000  </w:t>
+            </w:r>
+          </w:p>
+          <w:p>
+            <w:pPr>
+              <w:cnfStyle w:val="000000100000" w:firstRow="0" w:lastRow="0" w:firstColumn="0" w:lastColumn="0" w:oddVBand="0" w:evenVBand="0" w:oddHBand="1" w:evenHBand="0" w:firstRowFirstColumn="0" w:firstRowLastColumn="0" w:lastRowFirstColumn="0" w:lastRowLastColumn="0"/>
+              <w:rPr>
+                <w:lang w:val="en-US"/>
+              </w:rPr>
+            </w:pPr>
+            <w:r>
+              <w:t xml:space="preserve">F1: 0.6667 </w:t>
+            </w:r>
+          </w:p>
+          <w:p>
+            <w:pPr>
+              <w:cnfStyle w:val="000000100000" w:firstRow="0" w:lastRow="0" w:firstColumn="0" w:lastColumn="0" w:oddVBand="0" w:evenVBand="0" w:oddHBand="1" w:evenHBand="0" w:firstRowFirstColumn="0" w:firstRowLastColumn="0" w:lastRowFirstColumn="0" w:lastRowLastColumn="0"/>
+            </w:pPr>
+            <w:r>
+              <w:t>Accuracy: 0.5000</w:t>
+            </w:r>
           </w:p>
         </w:tc>
         <w:tc>
@@ -794,7 +736,207 @@
           <w:p>
             <w:pPr>
               <w:cnfStyle w:val="000000100000" w:firstRow="0" w:lastRow="0" w:firstColumn="0" w:lastColumn="0" w:oddVBand="0" w:evenVBand="0" w:oddHBand="1" w:evenHBand="0" w:firstRowFirstColumn="0" w:firstRowLastColumn="0" w:lastRowFirstColumn="0" w:lastRowLastColumn="0"/>
-            </w:pPr>
+              <w:rPr>
+                <w:lang w:val="en-US"/>
+              </w:rPr>
+            </w:pPr>
+            <w:r>
+              <w:rPr>
+                <w:lang w:val="en-US"/>
+              </w:rPr>
+              <w:t xml:space="preserve">accuracy: 0.8943 </w:t>
+            </w:r>
+          </w:p>
+          <w:p>
+            <w:pPr>
+              <w:cnfStyle w:val="000000100000" w:firstRow="0" w:lastRow="0" w:firstColumn="0" w:lastColumn="0" w:oddVBand="0" w:evenVBand="0" w:oddHBand="1" w:evenHBand="0" w:firstRowFirstColumn="0" w:firstRowLastColumn="0" w:lastRowFirstColumn="0" w:lastRowLastColumn="0"/>
+              <w:rPr>
+                <w:lang w:val="en-US"/>
+              </w:rPr>
+            </w:pPr>
+            <w:r>
+              <w:rPr>
+                <w:lang w:val="en-US"/>
+              </w:rPr>
+              <w:t>loss: 0.9756</w:t>
+            </w:r>
+          </w:p>
+          <w:p>
+            <w:pPr>
+              <w:cnfStyle w:val="000000100000" w:firstRow="0" w:lastRow="0" w:firstColumn="0" w:lastColumn="0" w:oddVBand="0" w:evenVBand="0" w:oddHBand="1" w:evenHBand="0" w:firstRowFirstColumn="0" w:firstRowLastColumn="0" w:lastRowFirstColumn="0" w:lastRowLastColumn="0"/>
+              <w:rPr>
+                <w:lang w:val="en-US"/>
+              </w:rPr>
+            </w:pPr>
+            <w:proofErr w:type="spellStart"/>
+            <w:r>
+              <w:rPr>
+                <w:lang w:val="en-US"/>
+              </w:rPr>
+              <w:t>val_accuracy</w:t>
+            </w:r>
+            <w:proofErr w:type="spellEnd"/>
+            <w:r>
+              <w:rPr>
+                <w:lang w:val="en-US"/>
+              </w:rPr>
+              <w:t xml:space="preserve">: 0.8934 </w:t>
+            </w:r>
+          </w:p>
+          <w:p>
+            <w:pPr>
+              <w:cnfStyle w:val="000000100000" w:firstRow="0" w:lastRow="0" w:firstColumn="0" w:lastColumn="0" w:oddVBand="0" w:evenVBand="0" w:oddHBand="1" w:evenHBand="0" w:firstRowFirstColumn="0" w:firstRowLastColumn="0" w:lastRowFirstColumn="0" w:lastRowLastColumn="0"/>
+              <w:rPr>
+                <w:lang w:val="en-US"/>
+              </w:rPr>
+            </w:pPr>
+            <w:proofErr w:type="spellStart"/>
+            <w:r>
+              <w:rPr>
+                <w:lang w:val="en-US"/>
+              </w:rPr>
+              <w:t>val_loss</w:t>
+            </w:r>
+            <w:proofErr w:type="spellEnd"/>
+            <w:r>
+              <w:rPr>
+                <w:lang w:val="en-US"/>
+              </w:rPr>
+              <w:t>: 1.7953</w:t>
+            </w:r>
+          </w:p>
+          <w:p>
+            <w:pPr>
+              <w:cnfStyle w:val="000000100000" w:firstRow="0" w:lastRow="0" w:firstColumn="0" w:lastColumn="0" w:oddVBand="0" w:evenVBand="0" w:oddHBand="1" w:evenHBand="0" w:firstRowFirstColumn="0" w:firstRowLastColumn="0" w:lastRowFirstColumn="0" w:lastRowLastColumn="0"/>
+              <w:rPr>
+                <w:lang w:val="en-US"/>
+              </w:rPr>
+            </w:pPr>
+          </w:p>
+          <w:p>
+            <w:pPr>
+              <w:cnfStyle w:val="000000100000" w:firstRow="0" w:lastRow="0" w:firstColumn="0" w:lastColumn="0" w:oddVBand="0" w:evenVBand="0" w:oddHBand="1" w:evenHBand="0" w:firstRowFirstColumn="0" w:firstRowLastColumn="0" w:lastRowFirstColumn="0" w:lastRowLastColumn="0"/>
+            </w:pPr>
+            <w:r>
+              <w:t>Test metrics: {'accuracy': 0.9768133163452148, 'loss': 0.2133960723876953}</w:t>
+            </w:r>
+          </w:p>
+          <w:p>
+            <w:pPr>
+              <w:cnfStyle w:val="000000100000" w:firstRow="0" w:lastRow="0" w:firstColumn="0" w:lastColumn="0" w:oddVBand="0" w:evenVBand="0" w:oddHBand="1" w:evenHBand="0" w:firstRowFirstColumn="0" w:firstRowLastColumn="0" w:lastRowFirstColumn="0" w:lastRowLastColumn="0"/>
+              <w:rPr>
+                <w:rFonts w:ascii="Segoe UI Emoji" w:hAnsi="Segoe UI Emoji" w:cs="Segoe UI Emoji"/>
+                <w:lang w:val="en-US"/>
+              </w:rPr>
+            </w:pPr>
+          </w:p>
+          <w:p>
+            <w:pPr>
+              <w:cnfStyle w:val="000000100000" w:firstRow="0" w:lastRow="0" w:firstColumn="0" w:lastColumn="0" w:oddVBand="0" w:evenVBand="0" w:oddHBand="1" w:evenHBand="0" w:firstRowFirstColumn="0" w:firstRowLastColumn="0" w:lastRowFirstColumn="0" w:lastRowLastColumn="0"/>
+            </w:pPr>
+            <w:r>
+              <w:rPr>
+                <w:rFonts w:ascii="Segoe UI Emoji" w:hAnsi="Segoe UI Emoji" w:cs="Segoe UI Emoji"/>
+              </w:rPr>
+              <w:t>📌</w:t>
+            </w:r>
+            <w:r>
+              <w:t xml:space="preserve"> Threshold metrics @ 0.50</w:t>
+            </w:r>
+          </w:p>
+          <w:p>
+            <w:pPr>
+              <w:cnfStyle w:val="000000100000" w:firstRow="0" w:lastRow="0" w:firstColumn="0" w:lastColumn="0" w:oddVBand="0" w:evenVBand="0" w:oddHBand="1" w:evenHBand="0" w:firstRowFirstColumn="0" w:firstRowLastColumn="0" w:lastRowFirstColumn="0" w:lastRowLastColumn="0"/>
+            </w:pPr>
+            <w:r>
+              <w:t>Confusion Matrix [[TN, FP], [FN, TP]]:</w:t>
+            </w:r>
+          </w:p>
+          <w:p>
+            <w:pPr>
+              <w:cnfStyle w:val="000000100000" w:firstRow="0" w:lastRow="0" w:firstColumn="0" w:lastColumn="0" w:oddVBand="0" w:evenVBand="0" w:oddHBand="1" w:evenHBand="0" w:firstRowFirstColumn="0" w:firstRowLastColumn="0" w:lastRowFirstColumn="0" w:lastRowLastColumn="0"/>
+            </w:pPr>
+            <w:r>
+              <w:t>[[  2559  12310]</w:t>
+            </w:r>
+          </w:p>
+          <w:p>
+            <w:pPr>
+              <w:cnfStyle w:val="000000100000" w:firstRow="0" w:lastRow="0" w:firstColumn="0" w:lastColumn="0" w:oddVBand="0" w:evenVBand="0" w:oddHBand="1" w:evenHBand="0" w:firstRowFirstColumn="0" w:firstRowLastColumn="0" w:lastRowFirstColumn="0" w:lastRowLastColumn="0"/>
+            </w:pPr>
+            <w:r>
+              <w:t>[    70 518988]]</w:t>
+            </w:r>
+          </w:p>
+          <w:p>
+            <w:pPr>
+              <w:cnfStyle w:val="000000100000" w:firstRow="0" w:lastRow="0" w:firstColumn="0" w:lastColumn="0" w:oddVBand="0" w:evenVBand="0" w:oddHBand="1" w:evenHBand="0" w:firstRowFirstColumn="0" w:firstRowLastColumn="0" w:lastRowFirstColumn="0" w:lastRowLastColumn="0"/>
+              <w:rPr>
+                <w:lang w:val="en-US"/>
+              </w:rPr>
+            </w:pPr>
+          </w:p>
+          <w:p>
+            <w:pPr>
+              <w:cnfStyle w:val="000000100000" w:firstRow="0" w:lastRow="0" w:firstColumn="0" w:lastColumn="0" w:oddVBand="0" w:evenVBand="0" w:oddHBand="1" w:evenHBand="0" w:firstRowFirstColumn="0" w:firstRowLastColumn="0" w:lastRowFirstColumn="0" w:lastRowLastColumn="0"/>
+              <w:rPr>
+                <w:lang w:val="en-US"/>
+              </w:rPr>
+            </w:pPr>
+            <w:r>
+              <w:t xml:space="preserve">Precision: 0.9768  Recall: 0.9999 </w:t>
+            </w:r>
+          </w:p>
+          <w:p>
+            <w:pPr>
+              <w:cnfStyle w:val="000000100000" w:firstRow="0" w:lastRow="0" w:firstColumn="0" w:lastColumn="0" w:oddVBand="0" w:evenVBand="0" w:oddHBand="1" w:evenHBand="0" w:firstRowFirstColumn="0" w:firstRowLastColumn="0" w:lastRowFirstColumn="0" w:lastRowLastColumn="0"/>
+              <w:rPr>
+                <w:lang w:val="en-US"/>
+              </w:rPr>
+            </w:pPr>
+            <w:r>
+              <w:t xml:space="preserve"> F1: 0.9882 </w:t>
+            </w:r>
+          </w:p>
+          <w:p>
+            <w:pPr>
+              <w:cnfStyle w:val="000000100000" w:firstRow="0" w:lastRow="0" w:firstColumn="0" w:lastColumn="0" w:oddVBand="0" w:evenVBand="0" w:oddHBand="1" w:evenHBand="0" w:firstRowFirstColumn="0" w:firstRowLastColumn="0" w:lastRowFirstColumn="0" w:lastRowLastColumn="0"/>
+            </w:pPr>
+            <w:r>
+              <w:t xml:space="preserve"> Accuracy: 0.9768</w:t>
+            </w:r>
+          </w:p>
+          <w:p>
+            <w:pPr>
+              <w:cnfStyle w:val="000000100000" w:firstRow="0" w:lastRow="0" w:firstColumn="0" w:lastColumn="0" w:oddVBand="0" w:evenVBand="0" w:oddHBand="1" w:evenHBand="0" w:firstRowFirstColumn="0" w:firstRowLastColumn="0" w:lastRowFirstColumn="0" w:lastRowLastColumn="0"/>
+              <w:rPr>
+                <w:rFonts w:ascii="Segoe UI Emoji" w:hAnsi="Segoe UI Emoji" w:cs="Segoe UI Emoji"/>
+                <w:lang w:val="en-US"/>
+              </w:rPr>
+            </w:pPr>
+          </w:p>
+          <w:p>
+            <w:pPr>
+              <w:cnfStyle w:val="000000100000" w:firstRow="0" w:lastRow="0" w:firstColumn="0" w:lastColumn="0" w:oddVBand="0" w:evenVBand="0" w:oddHBand="1" w:evenHBand="0" w:firstRowFirstColumn="0" w:firstRowLastColumn="0" w:lastRowFirstColumn="0" w:lastRowLastColumn="0"/>
+            </w:pPr>
+            <w:r>
+              <w:rPr>
+                <w:rFonts w:ascii="Segoe UI Emoji" w:hAnsi="Segoe UI Emoji" w:cs="Segoe UI Emoji"/>
+              </w:rPr>
+              <w:lastRenderedPageBreak/>
+              <w:t>✅</w:t>
+            </w:r>
+            <w:r>
+              <w:t xml:space="preserve"> Audio training session completed with the latest repository code.</w:t>
+            </w:r>
+          </w:p>
+          <w:p>
+            <w:pPr>
+              <w:cnfStyle w:val="000000100000" w:firstRow="0" w:lastRow="0" w:firstColumn="0" w:lastColumn="0" w:oddVBand="0" w:evenVBand="0" w:oddHBand="1" w:evenHBand="0" w:firstRowFirstColumn="0" w:firstRowLastColumn="0" w:lastRowFirstColumn="0" w:lastRowLastColumn="0"/>
+            </w:pPr>
+            <w:r>
+              <w:t>Test metrics: {'accuracy': 0.9768133163452148, 'loss': 0.2133960723876953, 'threshold_metrics': {'threshold': 0.5, 'tn': 2559, 'fp': 12310, 'fn': 70, 'tp': 518988, 'precision': 0.9768303287420435, 'recall': 0.9998651403118534, 'f1': 0.9882135149881692, 'threshold_accuracy': 0.9768133096846573}}</w:t>
+            </w:r>
           </w:p>
         </w:tc>
         <w:tc>
@@ -806,17 +948,13 @@
               <w:cnfStyle w:val="000000100000" w:firstRow="0" w:lastRow="0" w:firstColumn="0" w:lastColumn="0" w:oddVBand="0" w:evenVBand="0" w:oddHBand="1" w:evenHBand="0" w:firstRowFirstColumn="0" w:firstRowLastColumn="0" w:lastRowFirstColumn="0" w:lastRowLastColumn="0"/>
             </w:pPr>
             <w:r>
+              <w:lastRenderedPageBreak/>
               <w:t>MLP → Rectified Linear Unit</w:t>
             </w:r>
             <w:r>
               <w:br/>
-              <w:t xml:space="preserve">Attention → </w:t>
-            </w:r>
-            <w:proofErr w:type="spellStart"/>
-            <w:r>
-              <w:t>Softmax</w:t>
-            </w:r>
-            <w:proofErr w:type="spellEnd"/>
+              <w:t>Attention → Softmax</w:t>
+            </w:r>
             <w:r>
               <w:br/>
               <w:t>Output → Sigmoid</w:t>
@@ -846,7 +984,7 @@
 </file>
 
 <file path=word/endnotes.xml><?xml version="1.0" encoding="utf-8"?>
-<w:endnotes xmlns:wpc="http://schemas.microsoft.com/office/word/2010/wordprocessingCanvas" xmlns:cx="http://schemas.microsoft.com/office/drawing/2014/chartex" xmlns:cx1="http://schemas.microsoft.com/office/drawing/2015/9/8/chartex" xmlns:cx2="http://schemas.microsoft.com/office/drawing/2015/10/21/chartex" xmlns:cx3="http://schemas.microsoft.com/office/drawing/2016/5/9/chartex" xmlns:cx4="http://schemas.microsoft.com/office/drawing/2016/5/10/chartex" xmlns:cx5="http://schemas.microsoft.com/office/drawing/2016/5/11/chartex" xmlns:cx6="http://schemas.microsoft.com/office/drawing/2016/5/12/chartex" xmlns:cx7="http://schemas.microsoft.com/office/drawing/2016/5/13/chartex" xmlns:cx8="http://schemas.microsoft.com/office/drawing/2016/5/14/chartex" xmlns:mc="http://schemas.openxmlformats.org/markup-compatibility/2006" xmlns:aink="http://schemas.microsoft.com/office/drawing/2016/ink" xmlns:am3d="http://schemas.microsoft.com/office/drawing/2017/model3d" xmlns:o="urn:schemas-microsoft-com:office:office" xmlns:oel="http://schemas.microsoft.com/office/2019/extlst" xmlns:r="http://schemas.openxmlformats.org/officeDocument/2006/relationships" xmlns:m="http://schemas.openxmlformats.org/officeDocument/2006/math" xmlns:v="urn:schemas-microsoft-com:vml" xmlns:wp14="http://schemas.microsoft.com/office/word/2010/wordprocessingDrawing" xmlns:wp="http://schemas.openxmlformats.org/drawingml/2006/wordprocessingDrawing" xmlns:w10="urn:schemas-microsoft-com:office:word" xmlns:w="http://schemas.openxmlformats.org/wordprocessingml/2006/main" xmlns:w14="http://schemas.microsoft.com/office/word/2010/wordml" xmlns:w15="http://schemas.microsoft.com/office/word/2012/wordml" xmlns:w16cex="http://schemas.microsoft.com/office/word/2018/wordml/cex" xmlns:w16cid="http://schemas.microsoft.com/office/word/2016/wordml/cid" xmlns:w16="http://schemas.microsoft.com/office/word/2018/wordml" xmlns:w16sdtdh="http://schemas.microsoft.com/office/word/2020/wordml/sdtdatahash" xmlns:w16se="http://schemas.microsoft.com/office/word/2015/wordml/symex" xmlns:wpg="http://schemas.microsoft.com/office/word/2010/wordprocessingGroup" xmlns:wpi="http://schemas.microsoft.com/office/word/2010/wordprocessingInk" xmlns:wne="http://schemas.microsoft.com/office/word/2006/wordml" xmlns:wps="http://schemas.microsoft.com/office/word/2010/wordprocessingShape" mc:Ignorable="w14 w15 w16se w16cid w16 w16cex w16sdtdh wp14">
+<w:endnotes xmlns:wpc="http://schemas.microsoft.com/office/word/2010/wordprocessingCanvas" xmlns:cx="http://schemas.microsoft.com/office/drawing/2014/chartex" xmlns:cx1="http://schemas.microsoft.com/office/drawing/2015/9/8/chartex" xmlns:cx2="http://schemas.microsoft.com/office/drawing/2015/10/21/chartex" xmlns:cx3="http://schemas.microsoft.com/office/drawing/2016/5/9/chartex" xmlns:cx4="http://schemas.microsoft.com/office/drawing/2016/5/10/chartex" xmlns:cx5="http://schemas.microsoft.com/office/drawing/2016/5/11/chartex" xmlns:cx6="http://schemas.microsoft.com/office/drawing/2016/5/12/chartex" xmlns:cx7="http://schemas.microsoft.com/office/drawing/2016/5/13/chartex" xmlns:cx8="http://schemas.microsoft.com/office/drawing/2016/5/14/chartex" xmlns:mc="http://schemas.openxmlformats.org/markup-compatibility/2006" xmlns:aink="http://schemas.microsoft.com/office/drawing/2016/ink" xmlns:am3d="http://schemas.microsoft.com/office/drawing/2017/model3d" xmlns:o="urn:schemas-microsoft-com:office:office" xmlns:oel="http://schemas.microsoft.com/office/2019/extlst" xmlns:r="http://schemas.openxmlformats.org/officeDocument/2006/relationships" xmlns:m="http://schemas.openxmlformats.org/officeDocument/2006/math" xmlns:v="urn:schemas-microsoft-com:vml" xmlns:wp14="http://schemas.microsoft.com/office/word/2010/wordprocessingDrawing" xmlns:wp="http://schemas.openxmlformats.org/drawingml/2006/wordprocessingDrawing" xmlns:w10="urn:schemas-microsoft-com:office:word" xmlns:w="http://schemas.openxmlformats.org/wordprocessingml/2006/main" xmlns:w14="http://schemas.microsoft.com/office/word/2010/wordml" xmlns:w15="http://schemas.microsoft.com/office/word/2012/wordml" xmlns:w16cex="http://schemas.microsoft.com/office/word/2018/wordml/cex" xmlns:w16cid="http://schemas.microsoft.com/office/word/2016/wordml/cid" xmlns:w16="http://schemas.microsoft.com/office/word/2018/wordml" xmlns:w16du="http://schemas.microsoft.com/office/word/2023/wordml/word16du" xmlns:w16sdtdh="http://schemas.microsoft.com/office/word/2020/wordml/sdtdatahash" xmlns:w16sdtfl="http://schemas.microsoft.com/office/word/2024/wordml/sdtformatlock" xmlns:w16se="http://schemas.microsoft.com/office/word/2015/wordml/symex" xmlns:wpg="http://schemas.microsoft.com/office/word/2010/wordprocessingGroup" xmlns:wpi="http://schemas.microsoft.com/office/word/2010/wordprocessingInk" xmlns:wne="http://schemas.microsoft.com/office/word/2006/wordml" xmlns:wps="http://schemas.microsoft.com/office/word/2010/wordprocessingShape" mc:Ignorable="w14 w15 w16se w16cid w16 w16cex w16sdtdh w16sdtfl w16du wp14">
   <w:endnote w:type="separator" w:id="-1">
     <w:p>
       <w:pPr>
@@ -871,7 +1009,7 @@
 </file>
 
 <file path=word/footnotes.xml><?xml version="1.0" encoding="utf-8"?>
-<w:footnotes xmlns:wpc="http://schemas.microsoft.com/office/word/2010/wordprocessingCanvas" xmlns:cx="http://schemas.microsoft.com/office/drawing/2014/chartex" xmlns:cx1="http://schemas.microsoft.com/office/drawing/2015/9/8/chartex" xmlns:cx2="http://schemas.microsoft.com/office/drawing/2015/10/21/chartex" xmlns:cx3="http://schemas.microsoft.com/office/drawing/2016/5/9/chartex" xmlns:cx4="http://schemas.microsoft.com/office/drawing/2016/5/10/chartex" xmlns:cx5="http://schemas.microsoft.com/office/drawing/2016/5/11/chartex" xmlns:cx6="http://schemas.microsoft.com/office/drawing/2016/5/12/chartex" xmlns:cx7="http://schemas.microsoft.com/office/drawing/2016/5/13/chartex" xmlns:cx8="http://schemas.microsoft.com/office/drawing/2016/5/14/chartex" xmlns:mc="http://schemas.openxmlformats.org/markup-compatibility/2006" xmlns:aink="http://schemas.microsoft.com/office/drawing/2016/ink" xmlns:am3d="http://schemas.microsoft.com/office/drawing/2017/model3d" xmlns:o="urn:schemas-microsoft-com:office:office" xmlns:oel="http://schemas.microsoft.com/office/2019/extlst" xmlns:r="http://schemas.openxmlformats.org/officeDocument/2006/relationships" xmlns:m="http://schemas.openxmlformats.org/officeDocument/2006/math" xmlns:v="urn:schemas-microsoft-com:vml" xmlns:wp14="http://schemas.microsoft.com/office/word/2010/wordprocessingDrawing" xmlns:wp="http://schemas.openxmlformats.org/drawingml/2006/wordprocessingDrawing" xmlns:w10="urn:schemas-microsoft-com:office:word" xmlns:w="http://schemas.openxmlformats.org/wordprocessingml/2006/main" xmlns:w14="http://schemas.microsoft.com/office/word/2010/wordml" xmlns:w15="http://schemas.microsoft.com/office/word/2012/wordml" xmlns:w16cex="http://schemas.microsoft.com/office/word/2018/wordml/cex" xmlns:w16cid="http://schemas.microsoft.com/office/word/2016/wordml/cid" xmlns:w16="http://schemas.microsoft.com/office/word/2018/wordml" xmlns:w16sdtdh="http://schemas.microsoft.com/office/word/2020/wordml/sdtdatahash" xmlns:w16se="http://schemas.microsoft.com/office/word/2015/wordml/symex" xmlns:wpg="http://schemas.microsoft.com/office/word/2010/wordprocessingGroup" xmlns:wpi="http://schemas.microsoft.com/office/word/2010/wordprocessingInk" xmlns:wne="http://schemas.microsoft.com/office/word/2006/wordml" xmlns:wps="http://schemas.microsoft.com/office/word/2010/wordprocessingShape" mc:Ignorable="w14 w15 w16se w16cid w16 w16cex w16sdtdh wp14">
+<w:footnotes xmlns:wpc="http://schemas.microsoft.com/office/word/2010/wordprocessingCanvas" xmlns:cx="http://schemas.microsoft.com/office/drawing/2014/chartex" xmlns:cx1="http://schemas.microsoft.com/office/drawing/2015/9/8/chartex" xmlns:cx2="http://schemas.microsoft.com/office/drawing/2015/10/21/chartex" xmlns:cx3="http://schemas.microsoft.com/office/drawing/2016/5/9/chartex" xmlns:cx4="http://schemas.microsoft.com/office/drawing/2016/5/10/chartex" xmlns:cx5="http://schemas.microsoft.com/office/drawing/2016/5/11/chartex" xmlns:cx6="http://schemas.microsoft.com/office/drawing/2016/5/12/chartex" xmlns:cx7="http://schemas.microsoft.com/office/drawing/2016/5/13/chartex" xmlns:cx8="http://schemas.microsoft.com/office/drawing/2016/5/14/chartex" xmlns:mc="http://schemas.openxmlformats.org/markup-compatibility/2006" xmlns:aink="http://schemas.microsoft.com/office/drawing/2016/ink" xmlns:am3d="http://schemas.microsoft.com/office/drawing/2017/model3d" xmlns:o="urn:schemas-microsoft-com:office:office" xmlns:oel="http://schemas.microsoft.com/office/2019/extlst" xmlns:r="http://schemas.openxmlformats.org/officeDocument/2006/relationships" xmlns:m="http://schemas.openxmlformats.org/officeDocument/2006/math" xmlns:v="urn:schemas-microsoft-com:vml" xmlns:wp14="http://schemas.microsoft.com/office/word/2010/wordprocessingDrawing" xmlns:wp="http://schemas.openxmlformats.org/drawingml/2006/wordprocessingDrawing" xmlns:w10="urn:schemas-microsoft-com:office:word" xmlns:w="http://schemas.openxmlformats.org/wordprocessingml/2006/main" xmlns:w14="http://schemas.microsoft.com/office/word/2010/wordml" xmlns:w15="http://schemas.microsoft.com/office/word/2012/wordml" xmlns:w16cex="http://schemas.microsoft.com/office/word/2018/wordml/cex" xmlns:w16cid="http://schemas.microsoft.com/office/word/2016/wordml/cid" xmlns:w16="http://schemas.microsoft.com/office/word/2018/wordml" xmlns:w16du="http://schemas.microsoft.com/office/word/2023/wordml/word16du" xmlns:w16sdtdh="http://schemas.microsoft.com/office/word/2020/wordml/sdtdatahash" xmlns:w16sdtfl="http://schemas.microsoft.com/office/word/2024/wordml/sdtformatlock" xmlns:w16se="http://schemas.microsoft.com/office/word/2015/wordml/symex" xmlns:wpg="http://schemas.microsoft.com/office/word/2010/wordprocessingGroup" xmlns:wpi="http://schemas.microsoft.com/office/word/2010/wordprocessingInk" xmlns:wne="http://schemas.microsoft.com/office/word/2006/wordml" xmlns:wps="http://schemas.microsoft.com/office/word/2010/wordprocessingShape" mc:Ignorable="w14 w15 w16se w16cid w16 w16cex w16sdtdh w16sdtfl w16du wp14">
   <w:footnote w:type="separator" w:id="-1">
     <w:p>
       <w:pPr>
@@ -896,7 +1034,7 @@
 </file>
 
 <file path=word/styles.xml><?xml version="1.0" encoding="utf-8"?>
-<w:styles xmlns:mc="http://schemas.openxmlformats.org/markup-compatibility/2006" xmlns:r="http://schemas.openxmlformats.org/officeDocument/2006/relationships" xmlns:w="http://schemas.openxmlformats.org/wordprocessingml/2006/main" xmlns:w14="http://schemas.microsoft.com/office/word/2010/wordml" xmlns:w15="http://schemas.microsoft.com/office/word/2012/wordml" xmlns:w16cex="http://schemas.microsoft.com/office/word/2018/wordml/cex" xmlns:w16cid="http://schemas.microsoft.com/office/word/2016/wordml/cid" xmlns:w16="http://schemas.microsoft.com/office/word/2018/wordml" xmlns:w16sdtdh="http://schemas.microsoft.com/office/word/2020/wordml/sdtdatahash" xmlns:w16se="http://schemas.microsoft.com/office/word/2015/wordml/symex" mc:Ignorable="w14 w15 w16se w16cid w16 w16cex w16sdtdh">
+<w:styles xmlns:mc="http://schemas.openxmlformats.org/markup-compatibility/2006" xmlns:r="http://schemas.openxmlformats.org/officeDocument/2006/relationships" xmlns:w="http://schemas.openxmlformats.org/wordprocessingml/2006/main" xmlns:w14="http://schemas.microsoft.com/office/word/2010/wordml" xmlns:w15="http://schemas.microsoft.com/office/word/2012/wordml" xmlns:w16cex="http://schemas.microsoft.com/office/word/2018/wordml/cex" xmlns:w16cid="http://schemas.microsoft.com/office/word/2016/wordml/cid" xmlns:w16="http://schemas.microsoft.com/office/word/2018/wordml" xmlns:w16du="http://schemas.microsoft.com/office/word/2023/wordml/word16du" xmlns:w16sdtdh="http://schemas.microsoft.com/office/word/2020/wordml/sdtdatahash" xmlns:w16sdtfl="http://schemas.microsoft.com/office/word/2024/wordml/sdtformatlock" xmlns:w16se="http://schemas.microsoft.com/office/word/2015/wordml/symex" mc:Ignorable="w14 w15 w16se w16cid w16 w16cex w16sdtdh w16sdtfl w16du">
   <w:docDefaults>
     <w:rPrDefault>
       <w:rPr>
@@ -904,7 +1042,7 @@
         <w:kern w:val="2"/>
         <w:sz w:val="24"/>
         <w:szCs w:val="24"/>
-        <w:lang w:val="en-PK" w:eastAsia="en-US" w:bidi="ar-SA"/>
+        <w:lang w:eastAsia="en-US" w:bidi="ar-SA"/>
         <w14:ligatures w14:val="standardContextual"/>
       </w:rPr>
     </w:rPrDefault>

</xml_diff>

<commit_message>
AF_V2: add audio swish results to Research_Results
</commit_message>
<xml_diff>
--- a/Research_Results.docx
+++ b/Research_Results.docx
@@ -835,6 +835,200 @@
         </w:rPr>
       </w:pPr>
     </w:p>
+    <w:p/>
+    <w:p>
+      <w:pPr>
+        <w:pStyle w:val="Heading2"/>
+      </w:pPr>
+      <w:r>
+        <w:t>AF_V2 - Audio Model Results</w:t>
+      </w:r>
+    </w:p>
+    <w:p>
+      <w:r>
+        <w:t>Date: 2026-04-06 16:22:02</w:t>
+      </w:r>
+    </w:p>
+    <w:p>
+      <w:r>
+        <w:t>Branch: AF_V2</w:t>
+      </w:r>
+    </w:p>
+    <w:p>
+      <w:r>
+        <w:t>Activations: MLP=Swish, Attention=Softmax, Output=Sigmoid</w:t>
+      </w:r>
+    </w:p>
+    <w:p>
+      <w:r>
+        <w:t>Note: Audio model trained on Kaggle GPU</w:t>
+      </w:r>
+    </w:p>
+    <w:tbl>
+      <w:tblPr>
+        <w:tblStyle w:val="TableGrid"/>
+        <w:tblW w:type="auto" w:w="0"/>
+        <w:tblLook w:firstColumn="1" w:firstRow="1" w:lastColumn="0" w:lastRow="0" w:noHBand="0" w:noVBand="1" w:val="04A0"/>
+      </w:tblPr>
+      <w:tblGrid>
+        <w:gridCol w:w="4513"/>
+        <w:gridCol w:w="4513"/>
+      </w:tblGrid>
+      <w:tr>
+        <w:tc>
+          <w:tcPr>
+            <w:tcW w:type="dxa" w:w="4513"/>
+          </w:tcPr>
+          <w:p>
+            <w:r>
+              <w:t>Metric</w:t>
+            </w:r>
+          </w:p>
+        </w:tc>
+        <w:tc>
+          <w:tcPr>
+            <w:tcW w:type="dxa" w:w="4513"/>
+          </w:tcPr>
+          <w:p>
+            <w:r>
+              <w:t>Value</w:t>
+            </w:r>
+          </w:p>
+        </w:tc>
+      </w:tr>
+      <w:tr>
+        <w:tc>
+          <w:tcPr>
+            <w:tcW w:type="dxa" w:w="4513"/>
+          </w:tcPr>
+          <w:p>
+            <w:r>
+              <w:t>Train Accuracy</w:t>
+            </w:r>
+          </w:p>
+        </w:tc>
+        <w:tc>
+          <w:tcPr>
+            <w:tcW w:type="dxa" w:w="4513"/>
+          </w:tcPr>
+          <w:p>
+            <w:r>
+              <w:t>0.979385</w:t>
+            </w:r>
+          </w:p>
+        </w:tc>
+      </w:tr>
+      <w:tr>
+        <w:tc>
+          <w:tcPr>
+            <w:tcW w:type="dxa" w:w="4513"/>
+          </w:tcPr>
+          <w:p>
+            <w:r>
+              <w:t>Train Loss</w:t>
+            </w:r>
+          </w:p>
+        </w:tc>
+        <w:tc>
+          <w:tcPr>
+            <w:tcW w:type="dxa" w:w="4513"/>
+          </w:tcPr>
+          <w:p>
+            <w:r>
+              <w:t>0.054018</w:t>
+            </w:r>
+          </w:p>
+        </w:tc>
+      </w:tr>
+      <w:tr>
+        <w:tc>
+          <w:tcPr>
+            <w:tcW w:type="dxa" w:w="4513"/>
+          </w:tcPr>
+          <w:p>
+            <w:r>
+              <w:t>Validation Accuracy</w:t>
+            </w:r>
+          </w:p>
+        </w:tc>
+        <w:tc>
+          <w:tcPr>
+            <w:tcW w:type="dxa" w:w="4513"/>
+          </w:tcPr>
+          <w:p>
+            <w:r>
+              <w:t>0.893411</w:t>
+            </w:r>
+          </w:p>
+        </w:tc>
+      </w:tr>
+      <w:tr>
+        <w:tc>
+          <w:tcPr>
+            <w:tcW w:type="dxa" w:w="4513"/>
+          </w:tcPr>
+          <w:p>
+            <w:r>
+              <w:t>Validation Loss</w:t>
+            </w:r>
+          </w:p>
+        </w:tc>
+        <w:tc>
+          <w:tcPr>
+            <w:tcW w:type="dxa" w:w="4513"/>
+          </w:tcPr>
+          <w:p>
+            <w:r>
+              <w:t>1.648815</w:t>
+            </w:r>
+          </w:p>
+        </w:tc>
+      </w:tr>
+      <w:tr>
+        <w:tc>
+          <w:tcPr>
+            <w:tcW w:type="dxa" w:w="4513"/>
+          </w:tcPr>
+          <w:p>
+            <w:r>
+              <w:t>Test Accuracy</w:t>
+            </w:r>
+          </w:p>
+        </w:tc>
+        <w:tc>
+          <w:tcPr>
+            <w:tcW w:type="dxa" w:w="4513"/>
+          </w:tcPr>
+          <w:p>
+            <w:r>
+              <w:t>0.978546</w:t>
+            </w:r>
+          </w:p>
+        </w:tc>
+      </w:tr>
+      <w:tr>
+        <w:tc>
+          <w:tcPr>
+            <w:tcW w:type="dxa" w:w="4513"/>
+          </w:tcPr>
+          <w:p>
+            <w:r>
+              <w:t>Test Loss</w:t>
+            </w:r>
+          </w:p>
+        </w:tc>
+        <w:tc>
+          <w:tcPr>
+            <w:tcW w:type="dxa" w:w="4513"/>
+          </w:tcPr>
+          <w:p>
+            <w:r>
+              <w:t>0.177867</w:t>
+            </w:r>
+          </w:p>
+        </w:tc>
+      </w:tr>
+    </w:tbl>
     <w:sectPr>
       <w:pgSz w:w="11906" w:h="16838"/>
       <w:pgMar w:top="1440" w:right="1440" w:bottom="1440" w:left="1440" w:header="708" w:footer="708" w:gutter="0"/>

</xml_diff>

<commit_message>
AF_V2: update results doc with full precision metrics
</commit_message>
<xml_diff>
--- a/Research_Results.docx
+++ b/Research_Results.docx
@@ -1024,6 +1024,200 @@
           <w:p>
             <w:r>
               <w:t>0.177867</w:t>
+            </w:r>
+          </w:p>
+        </w:tc>
+      </w:tr>
+    </w:tbl>
+    <w:p/>
+    <w:p>
+      <w:pPr>
+        <w:pStyle w:val="Heading2"/>
+      </w:pPr>
+      <w:r>
+        <w:t>AF_V2 - Audio Model Results</w:t>
+      </w:r>
+    </w:p>
+    <w:p>
+      <w:r>
+        <w:t>Date: 2026-04-06 16:28:49</w:t>
+      </w:r>
+    </w:p>
+    <w:p>
+      <w:r>
+        <w:t>Branch: AF_V2</w:t>
+      </w:r>
+    </w:p>
+    <w:p>
+      <w:r>
+        <w:t>Activations: MLP=Swish, Attention=Softmax, Output=Sigmoid</w:t>
+      </w:r>
+    </w:p>
+    <w:p>
+      <w:r>
+        <w:t>Note: Audio model trained on Kaggle GPU</w:t>
+      </w:r>
+    </w:p>
+    <w:tbl>
+      <w:tblPr>
+        <w:tblStyle w:val="TableGrid"/>
+        <w:tblW w:type="auto" w:w="0"/>
+        <w:tblLook w:firstColumn="1" w:firstRow="1" w:lastColumn="0" w:lastRow="0" w:noHBand="0" w:noVBand="1" w:val="04A0"/>
+      </w:tblPr>
+      <w:tblGrid>
+        <w:gridCol w:w="4513"/>
+        <w:gridCol w:w="4513"/>
+      </w:tblGrid>
+      <w:tr>
+        <w:tc>
+          <w:tcPr>
+            <w:tcW w:type="dxa" w:w="4513"/>
+          </w:tcPr>
+          <w:p>
+            <w:r>
+              <w:t>Metric</w:t>
+            </w:r>
+          </w:p>
+        </w:tc>
+        <w:tc>
+          <w:tcPr>
+            <w:tcW w:type="dxa" w:w="4513"/>
+          </w:tcPr>
+          <w:p>
+            <w:r>
+              <w:t>Value</w:t>
+            </w:r>
+          </w:p>
+        </w:tc>
+      </w:tr>
+      <w:tr>
+        <w:tc>
+          <w:tcPr>
+            <w:tcW w:type="dxa" w:w="4513"/>
+          </w:tcPr>
+          <w:p>
+            <w:r>
+              <w:t>Train Accuracy</w:t>
+            </w:r>
+          </w:p>
+        </w:tc>
+        <w:tc>
+          <w:tcPr>
+            <w:tcW w:type="dxa" w:w="4513"/>
+          </w:tcPr>
+          <w:p>
+            <w:r>
+              <w:t>0.97938472032547</w:t>
+            </w:r>
+          </w:p>
+        </w:tc>
+      </w:tr>
+      <w:tr>
+        <w:tc>
+          <w:tcPr>
+            <w:tcW w:type="dxa" w:w="4513"/>
+          </w:tcPr>
+          <w:p>
+            <w:r>
+              <w:t>Train Loss</w:t>
+            </w:r>
+          </w:p>
+        </w:tc>
+        <w:tc>
+          <w:tcPr>
+            <w:tcW w:type="dxa" w:w="4513"/>
+          </w:tcPr>
+          <w:p>
+            <w:r>
+              <w:t>0.054017942398786545</w:t>
+            </w:r>
+          </w:p>
+        </w:tc>
+      </w:tr>
+      <w:tr>
+        <w:tc>
+          <w:tcPr>
+            <w:tcW w:type="dxa" w:w="4513"/>
+          </w:tcPr>
+          <w:p>
+            <w:r>
+              <w:t>Validation Accuracy</w:t>
+            </w:r>
+          </w:p>
+        </w:tc>
+        <w:tc>
+          <w:tcPr>
+            <w:tcW w:type="dxa" w:w="4513"/>
+          </w:tcPr>
+          <w:p>
+            <w:r>
+              <w:t>0.893410861492157</w:t>
+            </w:r>
+          </w:p>
+        </w:tc>
+      </w:tr>
+      <w:tr>
+        <w:tc>
+          <w:tcPr>
+            <w:tcW w:type="dxa" w:w="4513"/>
+          </w:tcPr>
+          <w:p>
+            <w:r>
+              <w:t>Validation Loss</w:t>
+            </w:r>
+          </w:p>
+        </w:tc>
+        <w:tc>
+          <w:tcPr>
+            <w:tcW w:type="dxa" w:w="4513"/>
+          </w:tcPr>
+          <w:p>
+            <w:r>
+              <w:t>1.6488147974014282</w:t>
+            </w:r>
+          </w:p>
+        </w:tc>
+      </w:tr>
+      <w:tr>
+        <w:tc>
+          <w:tcPr>
+            <w:tcW w:type="dxa" w:w="4513"/>
+          </w:tcPr>
+          <w:p>
+            <w:r>
+              <w:t>Test Accuracy</w:t>
+            </w:r>
+          </w:p>
+        </w:tc>
+        <w:tc>
+          <w:tcPr>
+            <w:tcW w:type="dxa" w:w="4513"/>
+          </w:tcPr>
+          <w:p>
+            <w:r>
+              <w:t>0.9785457849502563</w:t>
+            </w:r>
+          </w:p>
+        </w:tc>
+      </w:tr>
+      <w:tr>
+        <w:tc>
+          <w:tcPr>
+            <w:tcW w:type="dxa" w:w="4513"/>
+          </w:tcPr>
+          <w:p>
+            <w:r>
+              <w:t>Test Loss</w:t>
+            </w:r>
+          </w:p>
+        </w:tc>
+        <w:tc>
+          <w:tcPr>
+            <w:tcW w:type="dxa" w:w="4513"/>
+          </w:tcPr>
+          <w:p>
+            <w:r>
+              <w:t>0.17786721885204315</w:t>
             </w:r>
           </w:p>
         </w:tc>

</xml_diff>

<commit_message>
AF_V2: remove duplicate AF_V2 results block
</commit_message>
<xml_diff>
--- a/Research_Results.docx
+++ b/Research_Results.docx
@@ -835,200 +835,6 @@
         </w:rPr>
       </w:pPr>
     </w:p>
-    <w:p/>
-    <w:p>
-      <w:pPr>
-        <w:pStyle w:val="Heading2"/>
-      </w:pPr>
-      <w:r>
-        <w:t>AF_V2 - Audio Model Results</w:t>
-      </w:r>
-    </w:p>
-    <w:p>
-      <w:r>
-        <w:t>Date: 2026-04-06 16:22:02</w:t>
-      </w:r>
-    </w:p>
-    <w:p>
-      <w:r>
-        <w:t>Branch: AF_V2</w:t>
-      </w:r>
-    </w:p>
-    <w:p>
-      <w:r>
-        <w:t>Activations: MLP=Swish, Attention=Softmax, Output=Sigmoid</w:t>
-      </w:r>
-    </w:p>
-    <w:p>
-      <w:r>
-        <w:t>Note: Audio model trained on Kaggle GPU</w:t>
-      </w:r>
-    </w:p>
-    <w:tbl>
-      <w:tblPr>
-        <w:tblStyle w:val="TableGrid"/>
-        <w:tblW w:type="auto" w:w="0"/>
-        <w:tblLook w:firstColumn="1" w:firstRow="1" w:lastColumn="0" w:lastRow="0" w:noHBand="0" w:noVBand="1" w:val="04A0"/>
-      </w:tblPr>
-      <w:tblGrid>
-        <w:gridCol w:w="4513"/>
-        <w:gridCol w:w="4513"/>
-      </w:tblGrid>
-      <w:tr>
-        <w:tc>
-          <w:tcPr>
-            <w:tcW w:type="dxa" w:w="4513"/>
-          </w:tcPr>
-          <w:p>
-            <w:r>
-              <w:t>Metric</w:t>
-            </w:r>
-          </w:p>
-        </w:tc>
-        <w:tc>
-          <w:tcPr>
-            <w:tcW w:type="dxa" w:w="4513"/>
-          </w:tcPr>
-          <w:p>
-            <w:r>
-              <w:t>Value</w:t>
-            </w:r>
-          </w:p>
-        </w:tc>
-      </w:tr>
-      <w:tr>
-        <w:tc>
-          <w:tcPr>
-            <w:tcW w:type="dxa" w:w="4513"/>
-          </w:tcPr>
-          <w:p>
-            <w:r>
-              <w:t>Train Accuracy</w:t>
-            </w:r>
-          </w:p>
-        </w:tc>
-        <w:tc>
-          <w:tcPr>
-            <w:tcW w:type="dxa" w:w="4513"/>
-          </w:tcPr>
-          <w:p>
-            <w:r>
-              <w:t>0.979385</w:t>
-            </w:r>
-          </w:p>
-        </w:tc>
-      </w:tr>
-      <w:tr>
-        <w:tc>
-          <w:tcPr>
-            <w:tcW w:type="dxa" w:w="4513"/>
-          </w:tcPr>
-          <w:p>
-            <w:r>
-              <w:t>Train Loss</w:t>
-            </w:r>
-          </w:p>
-        </w:tc>
-        <w:tc>
-          <w:tcPr>
-            <w:tcW w:type="dxa" w:w="4513"/>
-          </w:tcPr>
-          <w:p>
-            <w:r>
-              <w:t>0.054018</w:t>
-            </w:r>
-          </w:p>
-        </w:tc>
-      </w:tr>
-      <w:tr>
-        <w:tc>
-          <w:tcPr>
-            <w:tcW w:type="dxa" w:w="4513"/>
-          </w:tcPr>
-          <w:p>
-            <w:r>
-              <w:t>Validation Accuracy</w:t>
-            </w:r>
-          </w:p>
-        </w:tc>
-        <w:tc>
-          <w:tcPr>
-            <w:tcW w:type="dxa" w:w="4513"/>
-          </w:tcPr>
-          <w:p>
-            <w:r>
-              <w:t>0.893411</w:t>
-            </w:r>
-          </w:p>
-        </w:tc>
-      </w:tr>
-      <w:tr>
-        <w:tc>
-          <w:tcPr>
-            <w:tcW w:type="dxa" w:w="4513"/>
-          </w:tcPr>
-          <w:p>
-            <w:r>
-              <w:t>Validation Loss</w:t>
-            </w:r>
-          </w:p>
-        </w:tc>
-        <w:tc>
-          <w:tcPr>
-            <w:tcW w:type="dxa" w:w="4513"/>
-          </w:tcPr>
-          <w:p>
-            <w:r>
-              <w:t>1.648815</w:t>
-            </w:r>
-          </w:p>
-        </w:tc>
-      </w:tr>
-      <w:tr>
-        <w:tc>
-          <w:tcPr>
-            <w:tcW w:type="dxa" w:w="4513"/>
-          </w:tcPr>
-          <w:p>
-            <w:r>
-              <w:t>Test Accuracy</w:t>
-            </w:r>
-          </w:p>
-        </w:tc>
-        <w:tc>
-          <w:tcPr>
-            <w:tcW w:type="dxa" w:w="4513"/>
-          </w:tcPr>
-          <w:p>
-            <w:r>
-              <w:t>0.978546</w:t>
-            </w:r>
-          </w:p>
-        </w:tc>
-      </w:tr>
-      <w:tr>
-        <w:tc>
-          <w:tcPr>
-            <w:tcW w:type="dxa" w:w="4513"/>
-          </w:tcPr>
-          <w:p>
-            <w:r>
-              <w:t>Test Loss</w:t>
-            </w:r>
-          </w:p>
-        </w:tc>
-        <w:tc>
-          <w:tcPr>
-            <w:tcW w:type="dxa" w:w="4513"/>
-          </w:tcPr>
-          <w:p>
-            <w:r>
-              <w:t>0.177867</w:t>
-            </w:r>
-          </w:p>
-        </w:tc>
-      </w:tr>
-    </w:tbl>
     <w:p/>
     <w:p>
       <w:pPr>

</xml_diff>

<commit_message>
AF_V3: publish corrected Mish results
</commit_message>
<xml_diff>
--- a/Research_Results.docx
+++ b/Research_Results.docx
@@ -516,9 +516,7 @@
             <w:tcW w:w="2407" w:type="dxa"/>
           </w:tcPr>
           <w:p>
-            <w:pPr>
-              <w:cnfStyle w:val="000000000000" w:firstRow="0" w:lastRow="0" w:firstColumn="0" w:lastColumn="0" w:oddVBand="0" w:evenVBand="0" w:oddHBand="0" w:evenHBand="0" w:firstRowFirstColumn="0" w:firstRowLastColumn="0" w:lastRowFirstColumn="0" w:lastRowLastColumn="0"/>
-            </w:pPr>
+            <w:r/>
           </w:p>
         </w:tc>
         <w:tc>
@@ -526,9 +524,17 @@
             <w:tcW w:w="2663" w:type="dxa"/>
           </w:tcPr>
           <w:p>
-            <w:pPr>
-              <w:cnfStyle w:val="000000000000" w:firstRow="0" w:lastRow="0" w:firstColumn="0" w:lastColumn="0" w:oddVBand="0" w:evenVBand="0" w:oddHBand="0" w:evenHBand="0" w:firstRowFirstColumn="0" w:firstRowLastColumn="0" w:lastRowFirstColumn="0" w:lastRowLastColumn="0"/>
-            </w:pPr>
+            <w:r>
+              <w:t>final_train_accuracy: 0.9775474071502686</w:t>
+              <w:br/>
+              <w:t>final_train_loss: 0.060542624443769455</w:t>
+              <w:br/>
+              <w:t>final_val_accuracy: 0.893410861492157</w:t>
+              <w:br/>
+              <w:t>final_val_loss: 1.925218105316162</w:t>
+              <w:br/>
+              <w:t>Test metrics: {'accuracy': 0.9772103428840637, 'loss': 0.197870671749115, 'threshold_metrics': {'threshold': 0.5, 'tn': 3848, 'fp': 11021, 'fn': 1147, 'tp': 517911, 'precision': 0.9791636732131733, 'recall': 0.9977902276816657, 'f1': 0.9883891971874688, 'threshold_accuracy': 0.9772103677094435}}</w:t>
+            </w:r>
           </w:p>
         </w:tc>
         <w:tc>
@@ -536,19 +542,12 @@
             <w:tcW w:w="2033" w:type="dxa"/>
           </w:tcPr>
           <w:p>
-            <w:pPr>
-              <w:cnfStyle w:val="000000000000" w:firstRow="0" w:lastRow="0" w:firstColumn="0" w:lastColumn="0" w:oddVBand="0" w:evenVBand="0" w:oddHBand="0" w:evenHBand="0" w:firstRowFirstColumn="0" w:firstRowLastColumn="0" w:lastRowFirstColumn="0" w:lastRowLastColumn="0"/>
-            </w:pPr>
-            <w:r>
-              <w:t>MLP → Mish</w:t>
-            </w:r>
-            <w:r>
+            <w:r>
+              <w:t>MLP ? Mish</w:t>
               <w:br/>
-              <w:t>Attention → Softmax</w:t>
-            </w:r>
-            <w:r>
+              <w:t>Attention ? Softmax</w:t>
               <w:br/>
-              <w:t>Output → Sigmoid</w:t>
+              <w:t>Output ? Sigmoid</w:t>
             </w:r>
           </w:p>
         </w:tc>
@@ -641,12 +640,15 @@
           <w:lang w:val="en-US"/>
         </w:rPr>
       </w:pPr>
-      <w:r>
+      <w:r/>
+    </w:p>
+    <w:p>
+      <w:pPr>
         <w:rPr>
-          <w:b/>
-          <w:bCs/>
           <w:lang w:val="en-US"/>
         </w:rPr>
+      </w:pPr>
+      <w:r>
         <w:t>BRANCH: AF_V3</w:t>
       </w:r>
     </w:p>
@@ -657,9 +659,6 @@
         </w:rPr>
       </w:pPr>
       <w:r>
-        <w:rPr>
-          <w:lang w:val="en-US"/>
-        </w:rPr>
         <w:t>AUDIO MODEL:</w:t>
       </w:r>
     </w:p>
@@ -670,10 +669,7 @@
         </w:rPr>
       </w:pPr>
       <w:r>
-        <w:rPr>
-          <w:lang w:val="en-US"/>
-        </w:rPr>
-        <w:t xml:space="preserve">  accuracy: 0.9811</w:t>
+        <w:t>final_train_accuracy: 0.9775474071502686</w:t>
       </w:r>
     </w:p>
     <w:p>
@@ -683,10 +679,7 @@
         </w:rPr>
       </w:pPr>
       <w:r>
-        <w:rPr>
-          <w:lang w:val="en-US"/>
-        </w:rPr>
-        <w:t xml:space="preserve">  loss: 0.0519</w:t>
+        <w:t>final_train_loss: 0.060542624443769455</w:t>
       </w:r>
     </w:p>
     <w:p>
@@ -696,24 +689,7 @@
         </w:rPr>
       </w:pPr>
       <w:r>
-        <w:rPr>
-          <w:lang w:val="en-US"/>
-        </w:rPr>
-        <w:t xml:space="preserve">  </w:t>
-      </w:r>
-      <w:proofErr w:type="spellStart"/>
-      <w:r>
-        <w:rPr>
-          <w:lang w:val="en-US"/>
-        </w:rPr>
-        <w:t>val_accuracy</w:t>
-      </w:r>
-      <w:proofErr w:type="spellEnd"/>
-      <w:r>
-        <w:rPr>
-          <w:lang w:val="en-US"/>
-        </w:rPr>
-        <w:t>: 0.8934</w:t>
+        <w:t>final_val_accuracy: 0.893410861492157</w:t>
       </w:r>
     </w:p>
     <w:p>
@@ -723,24 +699,7 @@
         </w:rPr>
       </w:pPr>
       <w:r>
-        <w:rPr>
-          <w:lang w:val="en-US"/>
-        </w:rPr>
-        <w:t xml:space="preserve">  </w:t>
-      </w:r>
-      <w:proofErr w:type="spellStart"/>
-      <w:r>
-        <w:rPr>
-          <w:lang w:val="en-US"/>
-        </w:rPr>
-        <w:t>val_loss</w:t>
-      </w:r>
-      <w:proofErr w:type="spellEnd"/>
-      <w:r>
-        <w:rPr>
-          <w:lang w:val="en-US"/>
-        </w:rPr>
-        <w:t>: 2.1449</w:t>
+        <w:t>final_val_loss: 1.925218105316162</w:t>
       </w:r>
     </w:p>
     <w:p>
@@ -750,10 +709,7 @@
         </w:rPr>
       </w:pPr>
       <w:r>
-        <w:rPr>
-          <w:lang w:val="en-US"/>
-        </w:rPr>
-        <w:t xml:space="preserve">  Test metrics: {'accuracy': 0.9768357872962952, 'loss': 0.23769108951091766}</w:t>
+        <w:t>Test metrics: {'accuracy': 0.9772103428840637, 'loss': 0.197870671749115, 'threshold_metrics': {'threshold': 0.5, 'tn': 3848, 'fp': 11021, 'fn': 1147, 'tp': 517911, 'precision': 0.9791636732131733, 'recall': 0.9977902276816657, 'f1': 0.9883891971874688, 'threshold_accuracy': 0.9772103677094435}}</w:t>
       </w:r>
     </w:p>
     <w:p>
@@ -763,9 +719,6 @@
         </w:rPr>
       </w:pPr>
       <w:r>
-        <w:rPr>
-          <w:lang w:val="en-US"/>
-        </w:rPr>
         <w:t>ACTIVATION FUNCTION:</w:t>
       </w:r>
     </w:p>
@@ -776,10 +729,7 @@
         </w:rPr>
       </w:pPr>
       <w:r>
-        <w:rPr>
-          <w:lang w:val="en-US"/>
-        </w:rPr>
-        <w:t xml:space="preserve">  MLP → Swish</w:t>
+        <w:t>MLP ? Mish</w:t>
       </w:r>
     </w:p>
     <w:p>
@@ -789,32 +739,7 @@
         </w:rPr>
       </w:pPr>
       <w:r>
-        <w:rPr>
-          <w:lang w:val="en-US"/>
-        </w:rPr>
-        <w:t xml:space="preserve">  Attention → </w:t>
-      </w:r>
-      <w:proofErr w:type="spellStart"/>
-      <w:r>
-        <w:rPr>
-          <w:lang w:val="en-US"/>
-        </w:rPr>
-        <w:t>Softmax</w:t>
-      </w:r>
-      <w:proofErr w:type="spellEnd"/>
-    </w:p>
-    <w:p>
-      <w:pPr>
-        <w:rPr>
-          <w:lang w:val="en-US"/>
-        </w:rPr>
-      </w:pPr>
-      <w:r>
-        <w:rPr>
-          <w:lang w:val="en-US"/>
-        </w:rPr>
-        <w:lastRenderedPageBreak/>
-        <w:t xml:space="preserve">  Output → Sigmoid</w:t>
+        <w:t>Attention ? Softmax</w:t>
       </w:r>
     </w:p>
     <w:sectPr>

</xml_diff>

<commit_message>
AF_V3: updated results for video model
</commit_message>
<xml_diff>
--- a/Research_Results.docx
+++ b/Research_Results.docx
@@ -1,6 +1,6 @@
 
 <file path=word/document.xml><?xml version="1.0" encoding="utf-8"?>
-<w:document xmlns:wpc="http://schemas.microsoft.com/office/word/2010/wordprocessingCanvas" xmlns:cx="http://schemas.microsoft.com/office/drawing/2014/chartex" xmlns:cx1="http://schemas.microsoft.com/office/drawing/2015/9/8/chartex" xmlns:cx2="http://schemas.microsoft.com/office/drawing/2015/10/21/chartex" xmlns:cx3="http://schemas.microsoft.com/office/drawing/2016/5/9/chartex" xmlns:cx4="http://schemas.microsoft.com/office/drawing/2016/5/10/chartex" xmlns:cx5="http://schemas.microsoft.com/office/drawing/2016/5/11/chartex" xmlns:cx6="http://schemas.microsoft.com/office/drawing/2016/5/12/chartex" xmlns:cx7="http://schemas.microsoft.com/office/drawing/2016/5/13/chartex" xmlns:cx8="http://schemas.microsoft.com/office/drawing/2016/5/14/chartex" xmlns:mc="http://schemas.openxmlformats.org/markup-compatibility/2006" xmlns:aink="http://schemas.microsoft.com/office/drawing/2016/ink" xmlns:am3d="http://schemas.microsoft.com/office/drawing/2017/model3d" xmlns:o="urn:schemas-microsoft-com:office:office" xmlns:oel="http://schemas.microsoft.com/office/2019/extlst" xmlns:r="http://schemas.openxmlformats.org/officeDocument/2006/relationships" xmlns:m="http://schemas.openxmlformats.org/officeDocument/2006/math" xmlns:v="urn:schemas-microsoft-com:vml" xmlns:wp14="http://schemas.microsoft.com/office/word/2010/wordprocessingDrawing" xmlns:wp="http://schemas.openxmlformats.org/drawingml/2006/wordprocessingDrawing" xmlns:w10="urn:schemas-microsoft-com:office:word" xmlns:w="http://schemas.openxmlformats.org/wordprocessingml/2006/main" xmlns:w14="http://schemas.microsoft.com/office/word/2010/wordml" xmlns:w15="http://schemas.microsoft.com/office/word/2012/wordml" xmlns:w16cex="http://schemas.microsoft.com/office/word/2018/wordml/cex" xmlns:w16cid="http://schemas.microsoft.com/office/word/2016/wordml/cid" xmlns:w16="http://schemas.microsoft.com/office/word/2018/wordml" xmlns:w16sdtdh="http://schemas.microsoft.com/office/word/2020/wordml/sdtdatahash" xmlns:w16se="http://schemas.microsoft.com/office/word/2015/wordml/symex" xmlns:wpg="http://schemas.microsoft.com/office/word/2010/wordprocessingGroup" xmlns:wpi="http://schemas.microsoft.com/office/word/2010/wordprocessingInk" xmlns:wne="http://schemas.microsoft.com/office/word/2006/wordml" xmlns:wps="http://schemas.microsoft.com/office/word/2010/wordprocessingShape" mc:Ignorable="w14 w15 w16se w16cid w16 w16cex w16sdtdh wp14">
+<w:document xmlns:wpc="http://schemas.microsoft.com/office/word/2010/wordprocessingCanvas" xmlns:cx="http://schemas.microsoft.com/office/drawing/2014/chartex" xmlns:cx1="http://schemas.microsoft.com/office/drawing/2015/9/8/chartex" xmlns:cx2="http://schemas.microsoft.com/office/drawing/2015/10/21/chartex" xmlns:cx3="http://schemas.microsoft.com/office/drawing/2016/5/9/chartex" xmlns:cx4="http://schemas.microsoft.com/office/drawing/2016/5/10/chartex" xmlns:cx5="http://schemas.microsoft.com/office/drawing/2016/5/11/chartex" xmlns:cx6="http://schemas.microsoft.com/office/drawing/2016/5/12/chartex" xmlns:cx7="http://schemas.microsoft.com/office/drawing/2016/5/13/chartex" xmlns:cx8="http://schemas.microsoft.com/office/drawing/2016/5/14/chartex" xmlns:mc="http://schemas.openxmlformats.org/markup-compatibility/2006" xmlns:aink="http://schemas.microsoft.com/office/drawing/2016/ink" xmlns:am3d="http://schemas.microsoft.com/office/drawing/2017/model3d" xmlns:o="urn:schemas-microsoft-com:office:office" xmlns:oel="http://schemas.microsoft.com/office/2019/extlst" xmlns:r="http://schemas.openxmlformats.org/officeDocument/2006/relationships" xmlns:m="http://schemas.openxmlformats.org/officeDocument/2006/math" xmlns:v="urn:schemas-microsoft-com:vml" xmlns:wp14="http://schemas.microsoft.com/office/word/2010/wordprocessingDrawing" xmlns:wp="http://schemas.openxmlformats.org/drawingml/2006/wordprocessingDrawing" xmlns:w10="urn:schemas-microsoft-com:office:word" xmlns:w="http://schemas.openxmlformats.org/wordprocessingml/2006/main" xmlns:w14="http://schemas.microsoft.com/office/word/2010/wordml" xmlns:w15="http://schemas.microsoft.com/office/word/2012/wordml" xmlns:w16cex="http://schemas.microsoft.com/office/word/2018/wordml/cex" xmlns:w16cid="http://schemas.microsoft.com/office/word/2016/wordml/cid" xmlns:w16="http://schemas.microsoft.com/office/word/2018/wordml" xmlns:w16du="http://schemas.microsoft.com/office/word/2023/wordml/word16du" xmlns:w16sdtdh="http://schemas.microsoft.com/office/word/2020/wordml/sdtdatahash" xmlns:w16sdtfl="http://schemas.microsoft.com/office/word/2024/wordml/sdtformatlock" xmlns:w16se="http://schemas.microsoft.com/office/word/2015/wordml/symex" xmlns:wpg="http://schemas.microsoft.com/office/word/2010/wordprocessingGroup" xmlns:wpi="http://schemas.microsoft.com/office/word/2010/wordprocessingInk" xmlns:wne="http://schemas.microsoft.com/office/word/2006/wordml" xmlns:wps="http://schemas.microsoft.com/office/word/2010/wordprocessingShape" mc:Ignorable="w14 w15 w16se w16cid w16 w16cex w16sdtdh w16sdtfl w16du wp14">
   <w:body>
     <w:tbl>
       <w:tblPr>
@@ -10,10 +10,10 @@
         <w:tblLook w:val="04A0" w:firstRow="1" w:lastRow="0" w:firstColumn="1" w:lastColumn="0" w:noHBand="0" w:noVBand="1"/>
       </w:tblPr>
       <w:tblGrid>
-        <w:gridCol w:w="1923"/>
-        <w:gridCol w:w="2407"/>
-        <w:gridCol w:w="2663"/>
-        <w:gridCol w:w="2033"/>
+        <w:gridCol w:w="1461"/>
+        <w:gridCol w:w="3122"/>
+        <w:gridCol w:w="2721"/>
+        <w:gridCol w:w="1722"/>
       </w:tblGrid>
       <w:tr>
         <w:trPr>
@@ -516,7 +516,148 @@
             <w:tcW w:w="2407" w:type="dxa"/>
           </w:tcPr>
           <w:p>
-            <w:r/>
+            <w:pPr>
+              <w:cnfStyle w:val="000000000000" w:firstRow="0" w:lastRow="0" w:firstColumn="0" w:lastColumn="0" w:oddVBand="0" w:evenVBand="0" w:oddHBand="0" w:evenHBand="0" w:firstRowFirstColumn="0" w:firstRowLastColumn="0" w:lastRowFirstColumn="0" w:lastRowLastColumn="0"/>
+            </w:pPr>
+            <w:r>
+              <w:t xml:space="preserve">accuracy: 0.1539  </w:t>
+            </w:r>
+          </w:p>
+          <w:p>
+            <w:pPr>
+              <w:cnfStyle w:val="000000000000" w:firstRow="0" w:lastRow="0" w:firstColumn="0" w:lastColumn="0" w:oddVBand="0" w:evenVBand="0" w:oddHBand="0" w:evenHBand="0" w:firstRowFirstColumn="0" w:firstRowLastColumn="0" w:lastRowFirstColumn="0" w:lastRowLastColumn="0"/>
+            </w:pPr>
+            <w:r>
+              <w:t>loss: 5.1934</w:t>
+            </w:r>
+          </w:p>
+          <w:p>
+            <w:pPr>
+              <w:cnfStyle w:val="000000000000" w:firstRow="0" w:lastRow="0" w:firstColumn="0" w:lastColumn="0" w:oddVBand="0" w:evenVBand="0" w:oddHBand="0" w:evenHBand="0" w:firstRowFirstColumn="0" w:firstRowLastColumn="0" w:lastRowFirstColumn="0" w:lastRowLastColumn="0"/>
+            </w:pPr>
+            <w:proofErr w:type="spellStart"/>
+            <w:r>
+              <w:t>val_accuracy</w:t>
+            </w:r>
+            <w:proofErr w:type="spellEnd"/>
+            <w:r>
+              <w:t xml:space="preserve">: 0.5000 </w:t>
+            </w:r>
+            <w:proofErr w:type="spellStart"/>
+            <w:r>
+              <w:t>val_loss</w:t>
+            </w:r>
+            <w:proofErr w:type="spellEnd"/>
+            <w:r>
+              <w:t>: 3.0699</w:t>
+            </w:r>
+          </w:p>
+          <w:p>
+            <w:pPr>
+              <w:cnfStyle w:val="000000000000" w:firstRow="0" w:lastRow="0" w:firstColumn="0" w:lastColumn="0" w:oddVBand="0" w:evenVBand="0" w:oddHBand="0" w:evenHBand="0" w:firstRowFirstColumn="0" w:firstRowLastColumn="0" w:lastRowFirstColumn="0" w:lastRowLastColumn="0"/>
+            </w:pPr>
+          </w:p>
+          <w:p>
+            <w:pPr>
+              <w:cnfStyle w:val="000000000000" w:firstRow="0" w:lastRow="0" w:firstColumn="0" w:lastColumn="0" w:oddVBand="0" w:evenVBand="0" w:oddHBand="0" w:evenHBand="0" w:firstRowFirstColumn="0" w:firstRowLastColumn="0" w:lastRowFirstColumn="0" w:lastRowLastColumn="0"/>
+            </w:pPr>
+            <w:r>
+              <w:t xml:space="preserve">Test metrics: </w:t>
+            </w:r>
+          </w:p>
+          <w:p>
+            <w:pPr>
+              <w:cnfStyle w:val="000000000000" w:firstRow="0" w:lastRow="0" w:firstColumn="0" w:lastColumn="0" w:oddVBand="0" w:evenVBand="0" w:oddHBand="0" w:evenHBand="0" w:firstRowFirstColumn="0" w:firstRowLastColumn="0" w:lastRowFirstColumn="0" w:lastRowLastColumn="0"/>
+            </w:pPr>
+            <w:r>
+              <w:t xml:space="preserve">{'accuracy': 0.5, </w:t>
+            </w:r>
+          </w:p>
+          <w:p>
+            <w:pPr>
+              <w:cnfStyle w:val="000000000000" w:firstRow="0" w:lastRow="0" w:firstColumn="0" w:lastColumn="0" w:oddVBand="0" w:evenVBand="0" w:oddHBand="0" w:evenHBand="0" w:firstRowFirstColumn="0" w:firstRowLastColumn="0" w:lastRowFirstColumn="0" w:lastRowLastColumn="0"/>
+            </w:pPr>
+            <w:r>
+              <w:t>'loss':3.0699236392974854}</w:t>
+            </w:r>
+          </w:p>
+          <w:p>
+            <w:pPr>
+              <w:cnfStyle w:val="000000000000" w:firstRow="0" w:lastRow="0" w:firstColumn="0" w:lastColumn="0" w:oddVBand="0" w:evenVBand="0" w:oddHBand="0" w:evenHBand="0" w:firstRowFirstColumn="0" w:firstRowLastColumn="0" w:lastRowFirstColumn="0" w:lastRowLastColumn="0"/>
+              <w:rPr>
+                <w:rFonts w:ascii="Segoe UI Emoji" w:hAnsi="Segoe UI Emoji" w:cs="Segoe UI Emoji"/>
+              </w:rPr>
+            </w:pPr>
+          </w:p>
+          <w:p>
+            <w:pPr>
+              <w:cnfStyle w:val="000000000000" w:firstRow="0" w:lastRow="0" w:firstColumn="0" w:lastColumn="0" w:oddVBand="0" w:evenVBand="0" w:oddHBand="0" w:evenHBand="0" w:firstRowFirstColumn="0" w:firstRowLastColumn="0" w:lastRowFirstColumn="0" w:lastRowLastColumn="0"/>
+            </w:pPr>
+            <w:r>
+              <w:rPr>
+                <w:rFonts w:ascii="Segoe UI Emoji" w:hAnsi="Segoe UI Emoji" w:cs="Segoe UI Emoji"/>
+              </w:rPr>
+              <w:t>📌</w:t>
+            </w:r>
+            <w:r>
+              <w:t xml:space="preserve"> Threshold metrics @ 0.50</w:t>
+            </w:r>
+          </w:p>
+          <w:p>
+            <w:pPr>
+              <w:cnfStyle w:val="000000000000" w:firstRow="0" w:lastRow="0" w:firstColumn="0" w:lastColumn="0" w:oddVBand="0" w:evenVBand="0" w:oddHBand="0" w:evenHBand="0" w:firstRowFirstColumn="0" w:firstRowLastColumn="0" w:lastRowFirstColumn="0" w:lastRowLastColumn="0"/>
+            </w:pPr>
+            <w:r>
+              <w:t>Confusion Matrix [[TN, FP], [FN, TP]]:</w:t>
+            </w:r>
+          </w:p>
+          <w:p>
+            <w:pPr>
+              <w:cnfStyle w:val="000000000000" w:firstRow="0" w:lastRow="0" w:firstColumn="0" w:lastColumn="0" w:oddVBand="0" w:evenVBand="0" w:oddHBand="0" w:evenHBand="0" w:firstRowFirstColumn="0" w:firstRowLastColumn="0" w:lastRowFirstColumn="0" w:lastRowLastColumn="0"/>
+            </w:pPr>
+            <w:r>
+              <w:t>[[    0 10000]</w:t>
+            </w:r>
+          </w:p>
+          <w:p>
+            <w:pPr>
+              <w:cnfStyle w:val="000000000000" w:firstRow="0" w:lastRow="0" w:firstColumn="0" w:lastColumn="0" w:oddVBand="0" w:evenVBand="0" w:oddHBand="0" w:evenHBand="0" w:firstRowFirstColumn="0" w:firstRowLastColumn="0" w:lastRowFirstColumn="0" w:lastRowLastColumn="0"/>
+            </w:pPr>
+            <w:r>
+              <w:t>[    0 10000]]</w:t>
+            </w:r>
+          </w:p>
+          <w:p>
+            <w:pPr>
+              <w:cnfStyle w:val="000000000000" w:firstRow="0" w:lastRow="0" w:firstColumn="0" w:lastColumn="0" w:oddVBand="0" w:evenVBand="0" w:oddHBand="0" w:evenHBand="0" w:firstRowFirstColumn="0" w:firstRowLastColumn="0" w:lastRowFirstColumn="0" w:lastRowLastColumn="0"/>
+            </w:pPr>
+            <w:r>
+              <w:t xml:space="preserve">Precision: 0.5000 </w:t>
+            </w:r>
+          </w:p>
+          <w:p>
+            <w:pPr>
+              <w:cnfStyle w:val="000000000000" w:firstRow="0" w:lastRow="0" w:firstColumn="0" w:lastColumn="0" w:oddVBand="0" w:evenVBand="0" w:oddHBand="0" w:evenHBand="0" w:firstRowFirstColumn="0" w:firstRowLastColumn="0" w:lastRowFirstColumn="0" w:lastRowLastColumn="0"/>
+            </w:pPr>
+            <w:r>
+              <w:t xml:space="preserve">Recall: 1.0000 </w:t>
+            </w:r>
+          </w:p>
+          <w:p>
+            <w:pPr>
+              <w:cnfStyle w:val="000000000000" w:firstRow="0" w:lastRow="0" w:firstColumn="0" w:lastColumn="0" w:oddVBand="0" w:evenVBand="0" w:oddHBand="0" w:evenHBand="0" w:firstRowFirstColumn="0" w:firstRowLastColumn="0" w:lastRowFirstColumn="0" w:lastRowLastColumn="0"/>
+            </w:pPr>
+            <w:r>
+              <w:t xml:space="preserve">F1: 0.6667 </w:t>
+            </w:r>
+          </w:p>
+          <w:p>
+            <w:pPr>
+              <w:cnfStyle w:val="000000000000" w:firstRow="0" w:lastRow="0" w:firstColumn="0" w:lastColumn="0" w:oddVBand="0" w:evenVBand="0" w:oddHBand="0" w:evenHBand="0" w:firstRowFirstColumn="0" w:firstRowLastColumn="0" w:lastRowFirstColumn="0" w:lastRowLastColumn="0"/>
+            </w:pPr>
+            <w:r>
+              <w:t>Accuracy: 0.5000</w:t>
+            </w:r>
           </w:p>
         </w:tc>
         <w:tc>
@@ -524,14 +665,25 @@
             <w:tcW w:w="2663" w:type="dxa"/>
           </w:tcPr>
           <w:p>
+            <w:pPr>
+              <w:cnfStyle w:val="000000000000" w:firstRow="0" w:lastRow="0" w:firstColumn="0" w:lastColumn="0" w:oddVBand="0" w:evenVBand="0" w:oddHBand="0" w:evenHBand="0" w:firstRowFirstColumn="0" w:firstRowLastColumn="0" w:lastRowFirstColumn="0" w:lastRowLastColumn="0"/>
+            </w:pPr>
             <w:r>
               <w:t>final_train_accuracy: 0.9775474071502686</w:t>
+            </w:r>
+            <w:r>
               <w:br/>
               <w:t>final_train_loss: 0.060542624443769455</w:t>
+            </w:r>
+            <w:r>
               <w:br/>
               <w:t>final_val_accuracy: 0.893410861492157</w:t>
+            </w:r>
+            <w:r>
               <w:br/>
               <w:t>final_val_loss: 1.925218105316162</w:t>
+            </w:r>
+            <w:r>
               <w:br/>
               <w:t>Test metrics: {'accuracy': 0.9772103428840637, 'loss': 0.197870671749115, 'threshold_metrics': {'threshold': 0.5, 'tn': 3848, 'fp': 11021, 'fn': 1147, 'tp': 517911, 'precision': 0.9791636732131733, 'recall': 0.9977902276816657, 'f1': 0.9883891971874688, 'threshold_accuracy': 0.9772103677094435}}</w:t>
             </w:r>
@@ -542,10 +694,17 @@
             <w:tcW w:w="2033" w:type="dxa"/>
           </w:tcPr>
           <w:p>
+            <w:pPr>
+              <w:cnfStyle w:val="000000000000" w:firstRow="0" w:lastRow="0" w:firstColumn="0" w:lastColumn="0" w:oddVBand="0" w:evenVBand="0" w:oddHBand="0" w:evenHBand="0" w:firstRowFirstColumn="0" w:firstRowLastColumn="0" w:lastRowFirstColumn="0" w:lastRowLastColumn="0"/>
+            </w:pPr>
             <w:r>
               <w:t>MLP ? Mish</w:t>
+            </w:r>
+            <w:r>
               <w:br/>
               <w:t>Attention ? Softmax</w:t>
+            </w:r>
+            <w:r>
               <w:br/>
               <w:t>Output ? Sigmoid</w:t>
             </w:r>
@@ -600,7 +759,11 @@
             </w:r>
             <w:r>
               <w:br/>
-              <w:t>Attention → Softmax</w:t>
+              <w:t xml:space="preserve">Attention → </w:t>
+            </w:r>
+            <w:r>
+              <w:lastRenderedPageBreak/>
+              <w:t>Softmax</w:t>
             </w:r>
             <w:r>
               <w:br/>
@@ -617,7 +780,6 @@
           <w:bCs/>
           <w:sz w:val="40"/>
           <w:szCs w:val="40"/>
-          <w:lang w:val="en-US"/>
         </w:rPr>
       </w:pPr>
     </w:p>
@@ -628,7 +790,6 @@
           <w:bCs/>
           <w:sz w:val="40"/>
           <w:szCs w:val="40"/>
-          <w:lang w:val="en-US"/>
         </w:rPr>
       </w:pPr>
     </w:p>
@@ -637,107 +798,55 @@
         <w:rPr>
           <w:b/>
           <w:bCs/>
-          <w:lang w:val="en-US"/>
         </w:rPr>
       </w:pPr>
-      <w:r/>
     </w:p>
     <w:p>
-      <w:pPr>
-        <w:rPr>
-          <w:lang w:val="en-US"/>
-        </w:rPr>
-      </w:pPr>
       <w:r>
         <w:t>BRANCH: AF_V3</w:t>
       </w:r>
     </w:p>
     <w:p>
-      <w:pPr>
-        <w:rPr>
-          <w:lang w:val="en-US"/>
-        </w:rPr>
-      </w:pPr>
       <w:r>
         <w:t>AUDIO MODEL:</w:t>
       </w:r>
     </w:p>
     <w:p>
-      <w:pPr>
-        <w:rPr>
-          <w:lang w:val="en-US"/>
-        </w:rPr>
-      </w:pPr>
       <w:r>
         <w:t>final_train_accuracy: 0.9775474071502686</w:t>
       </w:r>
     </w:p>
     <w:p>
-      <w:pPr>
-        <w:rPr>
-          <w:lang w:val="en-US"/>
-        </w:rPr>
-      </w:pPr>
       <w:r>
         <w:t>final_train_loss: 0.060542624443769455</w:t>
       </w:r>
     </w:p>
     <w:p>
-      <w:pPr>
-        <w:rPr>
-          <w:lang w:val="en-US"/>
-        </w:rPr>
-      </w:pPr>
       <w:r>
         <w:t>final_val_accuracy: 0.893410861492157</w:t>
       </w:r>
     </w:p>
     <w:p>
-      <w:pPr>
-        <w:rPr>
-          <w:lang w:val="en-US"/>
-        </w:rPr>
-      </w:pPr>
       <w:r>
         <w:t>final_val_loss: 1.925218105316162</w:t>
       </w:r>
     </w:p>
     <w:p>
-      <w:pPr>
-        <w:rPr>
-          <w:lang w:val="en-US"/>
-        </w:rPr>
-      </w:pPr>
       <w:r>
         <w:t>Test metrics: {'accuracy': 0.9772103428840637, 'loss': 0.197870671749115, 'threshold_metrics': {'threshold': 0.5, 'tn': 3848, 'fp': 11021, 'fn': 1147, 'tp': 517911, 'precision': 0.9791636732131733, 'recall': 0.9977902276816657, 'f1': 0.9883891971874688, 'threshold_accuracy': 0.9772103677094435}}</w:t>
       </w:r>
     </w:p>
     <w:p>
-      <w:pPr>
-        <w:rPr>
-          <w:lang w:val="en-US"/>
-        </w:rPr>
-      </w:pPr>
       <w:r>
         <w:t>ACTIVATION FUNCTION:</w:t>
       </w:r>
     </w:p>
     <w:p>
-      <w:pPr>
-        <w:rPr>
-          <w:lang w:val="en-US"/>
-        </w:rPr>
-      </w:pPr>
       <w:r>
         <w:t>MLP ? Mish</w:t>
       </w:r>
     </w:p>
     <w:p>
-      <w:pPr>
-        <w:rPr>
-          <w:lang w:val="en-US"/>
-        </w:rPr>
-      </w:pPr>
       <w:r>
         <w:t>Attention ? Softmax</w:t>
       </w:r>
@@ -753,7 +862,7 @@
 </file>
 
 <file path=word/endnotes.xml><?xml version="1.0" encoding="utf-8"?>
-<w:endnotes xmlns:wpc="http://schemas.microsoft.com/office/word/2010/wordprocessingCanvas" xmlns:cx="http://schemas.microsoft.com/office/drawing/2014/chartex" xmlns:cx1="http://schemas.microsoft.com/office/drawing/2015/9/8/chartex" xmlns:cx2="http://schemas.microsoft.com/office/drawing/2015/10/21/chartex" xmlns:cx3="http://schemas.microsoft.com/office/drawing/2016/5/9/chartex" xmlns:cx4="http://schemas.microsoft.com/office/drawing/2016/5/10/chartex" xmlns:cx5="http://schemas.microsoft.com/office/drawing/2016/5/11/chartex" xmlns:cx6="http://schemas.microsoft.com/office/drawing/2016/5/12/chartex" xmlns:cx7="http://schemas.microsoft.com/office/drawing/2016/5/13/chartex" xmlns:cx8="http://schemas.microsoft.com/office/drawing/2016/5/14/chartex" xmlns:mc="http://schemas.openxmlformats.org/markup-compatibility/2006" xmlns:aink="http://schemas.microsoft.com/office/drawing/2016/ink" xmlns:am3d="http://schemas.microsoft.com/office/drawing/2017/model3d" xmlns:o="urn:schemas-microsoft-com:office:office" xmlns:oel="http://schemas.microsoft.com/office/2019/extlst" xmlns:r="http://schemas.openxmlformats.org/officeDocument/2006/relationships" xmlns:m="http://schemas.openxmlformats.org/officeDocument/2006/math" xmlns:v="urn:schemas-microsoft-com:vml" xmlns:wp14="http://schemas.microsoft.com/office/word/2010/wordprocessingDrawing" xmlns:wp="http://schemas.openxmlformats.org/drawingml/2006/wordprocessingDrawing" xmlns:w10="urn:schemas-microsoft-com:office:word" xmlns:w="http://schemas.openxmlformats.org/wordprocessingml/2006/main" xmlns:w14="http://schemas.microsoft.com/office/word/2010/wordml" xmlns:w15="http://schemas.microsoft.com/office/word/2012/wordml" xmlns:w16cex="http://schemas.microsoft.com/office/word/2018/wordml/cex" xmlns:w16cid="http://schemas.microsoft.com/office/word/2016/wordml/cid" xmlns:w16="http://schemas.microsoft.com/office/word/2018/wordml" xmlns:w16sdtdh="http://schemas.microsoft.com/office/word/2020/wordml/sdtdatahash" xmlns:w16se="http://schemas.microsoft.com/office/word/2015/wordml/symex" xmlns:wpg="http://schemas.microsoft.com/office/word/2010/wordprocessingGroup" xmlns:wpi="http://schemas.microsoft.com/office/word/2010/wordprocessingInk" xmlns:wne="http://schemas.microsoft.com/office/word/2006/wordml" xmlns:wps="http://schemas.microsoft.com/office/word/2010/wordprocessingShape" mc:Ignorable="w14 w15 w16se w16cid w16 w16cex w16sdtdh wp14">
+<w:endnotes xmlns:wpc="http://schemas.microsoft.com/office/word/2010/wordprocessingCanvas" xmlns:cx="http://schemas.microsoft.com/office/drawing/2014/chartex" xmlns:cx1="http://schemas.microsoft.com/office/drawing/2015/9/8/chartex" xmlns:cx2="http://schemas.microsoft.com/office/drawing/2015/10/21/chartex" xmlns:cx3="http://schemas.microsoft.com/office/drawing/2016/5/9/chartex" xmlns:cx4="http://schemas.microsoft.com/office/drawing/2016/5/10/chartex" xmlns:cx5="http://schemas.microsoft.com/office/drawing/2016/5/11/chartex" xmlns:cx6="http://schemas.microsoft.com/office/drawing/2016/5/12/chartex" xmlns:cx7="http://schemas.microsoft.com/office/drawing/2016/5/13/chartex" xmlns:cx8="http://schemas.microsoft.com/office/drawing/2016/5/14/chartex" xmlns:mc="http://schemas.openxmlformats.org/markup-compatibility/2006" xmlns:aink="http://schemas.microsoft.com/office/drawing/2016/ink" xmlns:am3d="http://schemas.microsoft.com/office/drawing/2017/model3d" xmlns:o="urn:schemas-microsoft-com:office:office" xmlns:oel="http://schemas.microsoft.com/office/2019/extlst" xmlns:r="http://schemas.openxmlformats.org/officeDocument/2006/relationships" xmlns:m="http://schemas.openxmlformats.org/officeDocument/2006/math" xmlns:v="urn:schemas-microsoft-com:vml" xmlns:wp14="http://schemas.microsoft.com/office/word/2010/wordprocessingDrawing" xmlns:wp="http://schemas.openxmlformats.org/drawingml/2006/wordprocessingDrawing" xmlns:w10="urn:schemas-microsoft-com:office:word" xmlns:w="http://schemas.openxmlformats.org/wordprocessingml/2006/main" xmlns:w14="http://schemas.microsoft.com/office/word/2010/wordml" xmlns:w15="http://schemas.microsoft.com/office/word/2012/wordml" xmlns:w16cex="http://schemas.microsoft.com/office/word/2018/wordml/cex" xmlns:w16cid="http://schemas.microsoft.com/office/word/2016/wordml/cid" xmlns:w16="http://schemas.microsoft.com/office/word/2018/wordml" xmlns:w16du="http://schemas.microsoft.com/office/word/2023/wordml/word16du" xmlns:w16sdtdh="http://schemas.microsoft.com/office/word/2020/wordml/sdtdatahash" xmlns:w16sdtfl="http://schemas.microsoft.com/office/word/2024/wordml/sdtformatlock" xmlns:w16se="http://schemas.microsoft.com/office/word/2015/wordml/symex" xmlns:wpg="http://schemas.microsoft.com/office/word/2010/wordprocessingGroup" xmlns:wpi="http://schemas.microsoft.com/office/word/2010/wordprocessingInk" xmlns:wne="http://schemas.microsoft.com/office/word/2006/wordml" xmlns:wps="http://schemas.microsoft.com/office/word/2010/wordprocessingShape" mc:Ignorable="w14 w15 w16se w16cid w16 w16cex w16sdtdh w16sdtfl w16du wp14">
   <w:endnote w:type="separator" w:id="-1">
     <w:p>
       <w:pPr>
@@ -778,7 +887,7 @@
 </file>
 
 <file path=word/footnotes.xml><?xml version="1.0" encoding="utf-8"?>
-<w:footnotes xmlns:wpc="http://schemas.microsoft.com/office/word/2010/wordprocessingCanvas" xmlns:cx="http://schemas.microsoft.com/office/drawing/2014/chartex" xmlns:cx1="http://schemas.microsoft.com/office/drawing/2015/9/8/chartex" xmlns:cx2="http://schemas.microsoft.com/office/drawing/2015/10/21/chartex" xmlns:cx3="http://schemas.microsoft.com/office/drawing/2016/5/9/chartex" xmlns:cx4="http://schemas.microsoft.com/office/drawing/2016/5/10/chartex" xmlns:cx5="http://schemas.microsoft.com/office/drawing/2016/5/11/chartex" xmlns:cx6="http://schemas.microsoft.com/office/drawing/2016/5/12/chartex" xmlns:cx7="http://schemas.microsoft.com/office/drawing/2016/5/13/chartex" xmlns:cx8="http://schemas.microsoft.com/office/drawing/2016/5/14/chartex" xmlns:mc="http://schemas.openxmlformats.org/markup-compatibility/2006" xmlns:aink="http://schemas.microsoft.com/office/drawing/2016/ink" xmlns:am3d="http://schemas.microsoft.com/office/drawing/2017/model3d" xmlns:o="urn:schemas-microsoft-com:office:office" xmlns:oel="http://schemas.microsoft.com/office/2019/extlst" xmlns:r="http://schemas.openxmlformats.org/officeDocument/2006/relationships" xmlns:m="http://schemas.openxmlformats.org/officeDocument/2006/math" xmlns:v="urn:schemas-microsoft-com:vml" xmlns:wp14="http://schemas.microsoft.com/office/word/2010/wordprocessingDrawing" xmlns:wp="http://schemas.openxmlformats.org/drawingml/2006/wordprocessingDrawing" xmlns:w10="urn:schemas-microsoft-com:office:word" xmlns:w="http://schemas.openxmlformats.org/wordprocessingml/2006/main" xmlns:w14="http://schemas.microsoft.com/office/word/2010/wordml" xmlns:w15="http://schemas.microsoft.com/office/word/2012/wordml" xmlns:w16cex="http://schemas.microsoft.com/office/word/2018/wordml/cex" xmlns:w16cid="http://schemas.microsoft.com/office/word/2016/wordml/cid" xmlns:w16="http://schemas.microsoft.com/office/word/2018/wordml" xmlns:w16sdtdh="http://schemas.microsoft.com/office/word/2020/wordml/sdtdatahash" xmlns:w16se="http://schemas.microsoft.com/office/word/2015/wordml/symex" xmlns:wpg="http://schemas.microsoft.com/office/word/2010/wordprocessingGroup" xmlns:wpi="http://schemas.microsoft.com/office/word/2010/wordprocessingInk" xmlns:wne="http://schemas.microsoft.com/office/word/2006/wordml" xmlns:wps="http://schemas.microsoft.com/office/word/2010/wordprocessingShape" mc:Ignorable="w14 w15 w16se w16cid w16 w16cex w16sdtdh wp14">
+<w:footnotes xmlns:wpc="http://schemas.microsoft.com/office/word/2010/wordprocessingCanvas" xmlns:cx="http://schemas.microsoft.com/office/drawing/2014/chartex" xmlns:cx1="http://schemas.microsoft.com/office/drawing/2015/9/8/chartex" xmlns:cx2="http://schemas.microsoft.com/office/drawing/2015/10/21/chartex" xmlns:cx3="http://schemas.microsoft.com/office/drawing/2016/5/9/chartex" xmlns:cx4="http://schemas.microsoft.com/office/drawing/2016/5/10/chartex" xmlns:cx5="http://schemas.microsoft.com/office/drawing/2016/5/11/chartex" xmlns:cx6="http://schemas.microsoft.com/office/drawing/2016/5/12/chartex" xmlns:cx7="http://schemas.microsoft.com/office/drawing/2016/5/13/chartex" xmlns:cx8="http://schemas.microsoft.com/office/drawing/2016/5/14/chartex" xmlns:mc="http://schemas.openxmlformats.org/markup-compatibility/2006" xmlns:aink="http://schemas.microsoft.com/office/drawing/2016/ink" xmlns:am3d="http://schemas.microsoft.com/office/drawing/2017/model3d" xmlns:o="urn:schemas-microsoft-com:office:office" xmlns:oel="http://schemas.microsoft.com/office/2019/extlst" xmlns:r="http://schemas.openxmlformats.org/officeDocument/2006/relationships" xmlns:m="http://schemas.openxmlformats.org/officeDocument/2006/math" xmlns:v="urn:schemas-microsoft-com:vml" xmlns:wp14="http://schemas.microsoft.com/office/word/2010/wordprocessingDrawing" xmlns:wp="http://schemas.openxmlformats.org/drawingml/2006/wordprocessingDrawing" xmlns:w10="urn:schemas-microsoft-com:office:word" xmlns:w="http://schemas.openxmlformats.org/wordprocessingml/2006/main" xmlns:w14="http://schemas.microsoft.com/office/word/2010/wordml" xmlns:w15="http://schemas.microsoft.com/office/word/2012/wordml" xmlns:w16cex="http://schemas.microsoft.com/office/word/2018/wordml/cex" xmlns:w16cid="http://schemas.microsoft.com/office/word/2016/wordml/cid" xmlns:w16="http://schemas.microsoft.com/office/word/2018/wordml" xmlns:w16du="http://schemas.microsoft.com/office/word/2023/wordml/word16du" xmlns:w16sdtdh="http://schemas.microsoft.com/office/word/2020/wordml/sdtdatahash" xmlns:w16sdtfl="http://schemas.microsoft.com/office/word/2024/wordml/sdtformatlock" xmlns:w16se="http://schemas.microsoft.com/office/word/2015/wordml/symex" xmlns:wpg="http://schemas.microsoft.com/office/word/2010/wordprocessingGroup" xmlns:wpi="http://schemas.microsoft.com/office/word/2010/wordprocessingInk" xmlns:wne="http://schemas.microsoft.com/office/word/2006/wordml" xmlns:wps="http://schemas.microsoft.com/office/word/2010/wordprocessingShape" mc:Ignorable="w14 w15 w16se w16cid w16 w16cex w16sdtdh w16sdtfl w16du wp14">
   <w:footnote w:type="separator" w:id="-1">
     <w:p>
       <w:pPr>
@@ -803,7 +912,7 @@
 </file>
 
 <file path=word/styles.xml><?xml version="1.0" encoding="utf-8"?>
-<w:styles xmlns:mc="http://schemas.openxmlformats.org/markup-compatibility/2006" xmlns:r="http://schemas.openxmlformats.org/officeDocument/2006/relationships" xmlns:w="http://schemas.openxmlformats.org/wordprocessingml/2006/main" xmlns:w14="http://schemas.microsoft.com/office/word/2010/wordml" xmlns:w15="http://schemas.microsoft.com/office/word/2012/wordml" xmlns:w16cex="http://schemas.microsoft.com/office/word/2018/wordml/cex" xmlns:w16cid="http://schemas.microsoft.com/office/word/2016/wordml/cid" xmlns:w16="http://schemas.microsoft.com/office/word/2018/wordml" xmlns:w16sdtdh="http://schemas.microsoft.com/office/word/2020/wordml/sdtdatahash" xmlns:w16se="http://schemas.microsoft.com/office/word/2015/wordml/symex" mc:Ignorable="w14 w15 w16se w16cid w16 w16cex w16sdtdh">
+<w:styles xmlns:mc="http://schemas.openxmlformats.org/markup-compatibility/2006" xmlns:r="http://schemas.openxmlformats.org/officeDocument/2006/relationships" xmlns:w="http://schemas.openxmlformats.org/wordprocessingml/2006/main" xmlns:w14="http://schemas.microsoft.com/office/word/2010/wordml" xmlns:w15="http://schemas.microsoft.com/office/word/2012/wordml" xmlns:w16cex="http://schemas.microsoft.com/office/word/2018/wordml/cex" xmlns:w16cid="http://schemas.microsoft.com/office/word/2016/wordml/cid" xmlns:w16="http://schemas.microsoft.com/office/word/2018/wordml" xmlns:w16du="http://schemas.microsoft.com/office/word/2023/wordml/word16du" xmlns:w16sdtdh="http://schemas.microsoft.com/office/word/2020/wordml/sdtdatahash" xmlns:w16sdtfl="http://schemas.microsoft.com/office/word/2024/wordml/sdtformatlock" xmlns:w16se="http://schemas.microsoft.com/office/word/2015/wordml/symex" mc:Ignorable="w14 w15 w16se w16cid w16 w16cex w16sdtdh w16sdtfl w16du">
   <w:docDefaults>
     <w:rPrDefault>
       <w:rPr>
@@ -811,7 +920,7 @@
         <w:kern w:val="2"/>
         <w:sz w:val="24"/>
         <w:szCs w:val="24"/>
-        <w:lang w:eastAsia="en-US" w:bidi="ar-SA"/>
+        <w:lang w:val="en-US" w:eastAsia="en-US" w:bidi="ar-SA"/>
         <w14:ligatures w14:val="standardContextual"/>
       </w:rPr>
     </w:rPrDefault>
@@ -1405,7 +1514,6 @@
   <w:style w:type="character" w:default="1" w:styleId="DefaultParagraphFont">
     <w:name w:val="Default Paragraph Font"/>
     <w:uiPriority w:val="1"/>
-    <w:semiHidden/>
     <w:unhideWhenUsed/>
   </w:style>
   <w:style w:type="table" w:default="1" w:styleId="TableNormal">

</xml_diff>